<commit_message>
[Resources][v0.3.0] Khởi tạo Resources Pack (Gói 3) - 5 Template kỹ thuật chuẩn
</commit_message>
<xml_diff>
--- a/00_Project_Management/Change Log.docx
+++ b/00_Project_Management/Change Log.docx
@@ -103,12 +103,6 @@
             <w:insideH w:val="single" w:color="auto" w:sz="4" w:space="0"/>
             <w:insideV w:val="single" w:color="auto" w:sz="4" w:space="0"/>
           </w:tblBorders>
-          <w:tblCellMar>
-            <w:top w:w="0" w:type="dxa"/>
-            <w:left w:w="10" w:type="dxa"/>
-            <w:bottom w:w="0" w:type="dxa"/>
-            <w:right w:w="10" w:type="dxa"/>
-          </w:tblCellMar>
         </w:tblPrEx>
         <w:tc>
           <w:tcPr>
@@ -378,17 +372,17 @@
           <w:p>
             <w:pPr>
               <w:jc w:val="left"/>
-            </w:pPr>
-            <w:r>
-              <w:rPr>
-                <w:rFonts w:ascii="Calibri" w:hAnsi="Calibri" w:eastAsia="Calibri" w:cs="Calibri"/>
-                <w:b w:val="0"/>
-                <w:bCs w:val="0"/>
-                <w:color w:val="000000"/>
-                <w:sz w:val="20"/>
-                <w:szCs w:val="20"/>
-              </w:rPr>
-              <w:t>(điền tên bạn)</w:t>
+              <w:rPr>
+                <w:rFonts w:hint="default"/>
+                <w:lang w:val="en-US"/>
+              </w:rPr>
+            </w:pPr>
+            <w:r>
+              <w:rPr>
+                <w:rFonts w:hint="default"/>
+                <w:lang w:val="en-US"/>
+              </w:rPr>
+              <w:t>Nguyen Gia Huy</w:t>
             </w:r>
           </w:p>
         </w:tc>
@@ -601,12 +595,6 @@
             <w:insideH w:val="single" w:color="auto" w:sz="4" w:space="0"/>
             <w:insideV w:val="single" w:color="auto" w:sz="4" w:space="0"/>
           </w:tblBorders>
-          <w:tblCellMar>
-            <w:top w:w="0" w:type="dxa"/>
-            <w:left w:w="10" w:type="dxa"/>
-            <w:bottom w:w="0" w:type="dxa"/>
-            <w:right w:w="10" w:type="dxa"/>
-          </w:tblCellMar>
         </w:tblPrEx>
         <w:trPr>
           <w:tblHeader/>
@@ -1565,8 +1553,6 @@
         </w:numPr>
         <w:spacing w:after="80"/>
       </w:pPr>
-      <w:bookmarkStart w:id="0" w:name="_GoBack"/>
-      <w:bookmarkEnd w:id="0"/>
       <w:r>
         <w:rPr>
           <w:rFonts w:hint="default"/>
@@ -1654,6 +1640,241 @@
         </w:rPr>
         <w:t>Removed</w:t>
       </w:r>
+    </w:p>
+    <w:p>
+      <w:pPr>
+        <w:pBdr>
+          <w:bottom w:val="single" w:color="595959" w:sz="6" w:space="1"/>
+        </w:pBdr>
+        <w:spacing w:before="100" w:after="200"/>
+      </w:pPr>
+    </w:p>
+    <w:p>
+      <w:pPr>
+        <w:spacing w:after="160"/>
+        <w:rPr>
+          <w:rFonts w:ascii="Calibri" w:hAnsi="Calibri" w:eastAsia="Calibri" w:cs="Calibri"/>
+          <w:b w:val="0"/>
+          <w:bCs w:val="0"/>
+          <w:i w:val="0"/>
+          <w:iCs w:val="0"/>
+          <w:color w:val="000000"/>
+          <w:sz w:val="21"/>
+          <w:szCs w:val="21"/>
+        </w:rPr>
+      </w:pPr>
+    </w:p>
+    <w:p>
+      <w:pPr>
+        <w:pStyle w:val="3"/>
+        <w:spacing w:before="320" w:after="160"/>
+      </w:pPr>
+      <w:r>
+        <w:rPr>
+          <w:rFonts w:ascii="Calibri" w:hAnsi="Calibri" w:eastAsia="Calibri" w:cs="Calibri"/>
+          <w:b/>
+          <w:bCs/>
+          <w:color w:val="2E5395"/>
+        </w:rPr>
+        <w:t>[v0.</w:t>
+      </w:r>
+      <w:r>
+        <w:rPr>
+          <w:rFonts w:hint="default" w:ascii="Calibri" w:hAnsi="Calibri" w:eastAsia="Calibri" w:cs="Calibri"/>
+          <w:b/>
+          <w:bCs/>
+          <w:color w:val="2E5395"/>
+          <w:lang w:val="en-US"/>
+        </w:rPr>
+        <w:t>3</w:t>
+      </w:r>
+      <w:r>
+        <w:rPr>
+          <w:rFonts w:ascii="Calibri" w:hAnsi="Calibri" w:eastAsia="Calibri" w:cs="Calibri"/>
+          <w:b/>
+          <w:bCs/>
+          <w:color w:val="2E5395"/>
+        </w:rPr>
+        <w:t xml:space="preserve">.0] - </w:t>
+      </w:r>
+      <w:r>
+        <w:rPr>
+          <w:rFonts w:hint="default" w:ascii="Calibri" w:hAnsi="Calibri" w:eastAsia="Calibri" w:cs="Calibri"/>
+          <w:b/>
+          <w:bCs/>
+          <w:color w:val="2E5395"/>
+          <w:lang w:val="en-US"/>
+        </w:rPr>
+        <w:t>23</w:t>
+      </w:r>
+      <w:r>
+        <w:rPr>
+          <w:rFonts w:ascii="Calibri" w:hAnsi="Calibri" w:eastAsia="Calibri" w:cs="Calibri"/>
+          <w:b/>
+          <w:bCs/>
+          <w:color w:val="2E5395"/>
+        </w:rPr>
+        <w:t xml:space="preserve"> /</w:t>
+      </w:r>
+      <w:r>
+        <w:rPr>
+          <w:rFonts w:hint="default" w:ascii="Calibri" w:hAnsi="Calibri" w:eastAsia="Calibri" w:cs="Calibri"/>
+          <w:b/>
+          <w:bCs/>
+          <w:color w:val="2E5395"/>
+          <w:lang w:val="en-US"/>
+        </w:rPr>
+        <w:t>07</w:t>
+      </w:r>
+      <w:r>
+        <w:rPr>
+          <w:rFonts w:ascii="Calibri" w:hAnsi="Calibri" w:eastAsia="Calibri" w:cs="Calibri"/>
+          <w:b/>
+          <w:bCs/>
+          <w:color w:val="2E5395"/>
+        </w:rPr>
+        <w:t xml:space="preserve"> /2026</w:t>
+      </w:r>
+    </w:p>
+    <w:p>
+      <w:pPr>
+        <w:pStyle w:val="4"/>
+        <w:spacing w:before="240" w:after="120"/>
+      </w:pPr>
+      <w:r>
+        <w:rPr>
+          <w:rFonts w:ascii="Calibri" w:hAnsi="Calibri" w:eastAsia="Calibri" w:cs="Calibri"/>
+          <w:b/>
+          <w:bCs/>
+          <w:color w:val="595959"/>
+        </w:rPr>
+        <w:t>Added</w:t>
+      </w:r>
+    </w:p>
+    <w:p>
+      <w:pPr>
+        <w:pStyle w:val="16"/>
+        <w:numPr>
+          <w:ilvl w:val="0"/>
+          <w:numId w:val="1"/>
+        </w:numPr>
+        <w:spacing w:after="80"/>
+      </w:pPr>
+      <w:r>
+        <w:rPr>
+          <w:rFonts w:hint="default"/>
+        </w:rPr>
+        <w:t>07_Engineering_Assets/Templates/: Thêm 5 mẫu tài liệu chuẩn (EKB-RES-201 đến EKB-RES-205) thuộc Resources Pack (Gói 3).</w:t>
+      </w:r>
+      <w:bookmarkStart w:id="0" w:name="_GoBack"/>
+      <w:bookmarkEnd w:id="0"/>
+    </w:p>
+    <w:p>
+      <w:pPr>
+        <w:pStyle w:val="4"/>
+        <w:spacing w:before="240" w:after="120"/>
+      </w:pPr>
+      <w:r>
+        <w:rPr>
+          <w:rFonts w:ascii="Calibri" w:hAnsi="Calibri" w:eastAsia="Calibri" w:cs="Calibri"/>
+          <w:b/>
+          <w:bCs/>
+          <w:color w:val="595959"/>
+        </w:rPr>
+        <w:t>Changed</w:t>
+      </w:r>
+    </w:p>
+    <w:p>
+      <w:pPr>
+        <w:spacing w:after="160"/>
+      </w:pPr>
+      <w:r>
+        <w:rPr>
+          <w:rFonts w:ascii="Calibri" w:hAnsi="Calibri" w:eastAsia="Calibri" w:cs="Calibri"/>
+          <w:b w:val="0"/>
+          <w:bCs w:val="0"/>
+          <w:i w:val="0"/>
+          <w:iCs w:val="0"/>
+          <w:color w:val="000000"/>
+          <w:sz w:val="21"/>
+          <w:szCs w:val="21"/>
+        </w:rPr>
+        <w:t>(chưa có)</w:t>
+      </w:r>
+    </w:p>
+    <w:p>
+      <w:pPr>
+        <w:pStyle w:val="4"/>
+        <w:spacing w:before="240" w:after="120"/>
+      </w:pPr>
+      <w:r>
+        <w:rPr>
+          <w:rFonts w:ascii="Calibri" w:hAnsi="Calibri" w:eastAsia="Calibri" w:cs="Calibri"/>
+          <w:b/>
+          <w:bCs/>
+          <w:color w:val="595959"/>
+        </w:rPr>
+        <w:t>Fixed</w:t>
+      </w:r>
+    </w:p>
+    <w:p>
+      <w:pPr>
+        <w:spacing w:after="160"/>
+      </w:pPr>
+      <w:r>
+        <w:rPr>
+          <w:rFonts w:ascii="Calibri" w:hAnsi="Calibri" w:eastAsia="Calibri" w:cs="Calibri"/>
+          <w:b w:val="0"/>
+          <w:bCs w:val="0"/>
+          <w:i w:val="0"/>
+          <w:iCs w:val="0"/>
+          <w:color w:val="000000"/>
+          <w:sz w:val="21"/>
+          <w:szCs w:val="21"/>
+        </w:rPr>
+        <w:t>(chưa có)</w:t>
+      </w:r>
+    </w:p>
+    <w:p>
+      <w:pPr>
+        <w:pStyle w:val="4"/>
+        <w:spacing w:before="240" w:after="120"/>
+      </w:pPr>
+      <w:r>
+        <w:rPr>
+          <w:rFonts w:ascii="Calibri" w:hAnsi="Calibri" w:eastAsia="Calibri" w:cs="Calibri"/>
+          <w:b/>
+          <w:bCs/>
+          <w:color w:val="595959"/>
+        </w:rPr>
+        <w:t>Removed</w:t>
+      </w:r>
+    </w:p>
+    <w:p>
+      <w:pPr>
+        <w:spacing w:after="160"/>
+      </w:pPr>
+      <w:r>
+        <w:rPr>
+          <w:rFonts w:ascii="Calibri" w:hAnsi="Calibri" w:eastAsia="Calibri" w:cs="Calibri"/>
+          <w:b w:val="0"/>
+          <w:bCs w:val="0"/>
+          <w:i w:val="0"/>
+          <w:iCs w:val="0"/>
+          <w:color w:val="000000"/>
+          <w:sz w:val="21"/>
+          <w:szCs w:val="21"/>
+        </w:rPr>
+        <w:t>(chưa có)</w:t>
+      </w:r>
+    </w:p>
+    <w:p>
+      <w:pPr>
+        <w:pBdr>
+          <w:bottom w:val="single" w:color="595959" w:sz="6" w:space="1"/>
+        </w:pBdr>
+        <w:spacing w:before="100" w:after="200"/>
+      </w:pPr>
     </w:p>
     <w:p>
       <w:pPr>

</xml_diff>

<commit_message>
[Projects][v0.4.0] Khởi tạo Project Pack (Gói 4) - 6 Project Templates chuẩn
Luu y cho [Resources][v0.3.0] Khởi tạo Resources Pack (Gói 3) - 5 Template kỹ thuật chuẩn
Chinh lai 07 do nham 03 tu lan truoc
</commit_message>
<xml_diff>
--- a/00_Project_Management/Change Log.docx
+++ b/00_Project_Management/Change Log.docx
@@ -103,6 +103,12 @@
             <w:insideH w:val="single" w:color="auto" w:sz="4" w:space="0"/>
             <w:insideV w:val="single" w:color="auto" w:sz="4" w:space="0"/>
           </w:tblBorders>
+          <w:tblCellMar>
+            <w:top w:w="0" w:type="dxa"/>
+            <w:left w:w="10" w:type="dxa"/>
+            <w:bottom w:w="0" w:type="dxa"/>
+            <w:right w:w="10" w:type="dxa"/>
+          </w:tblCellMar>
         </w:tblPrEx>
         <w:tc>
           <w:tcPr>
@@ -595,6 +601,12 @@
             <w:insideH w:val="single" w:color="auto" w:sz="4" w:space="0"/>
             <w:insideV w:val="single" w:color="auto" w:sz="4" w:space="0"/>
           </w:tblBorders>
+          <w:tblCellMar>
+            <w:top w:w="0" w:type="dxa"/>
+            <w:left w:w="10" w:type="dxa"/>
+            <w:bottom w:w="0" w:type="dxa"/>
+            <w:right w:w="10" w:type="dxa"/>
+          </w:tblCellMar>
         </w:tblPrEx>
         <w:trPr>
           <w:tblHeader/>
@@ -1766,8 +1778,6 @@
         </w:rPr>
         <w:t>07_Engineering_Assets/Templates/: Thêm 5 mẫu tài liệu chuẩn (EKB-RES-201 đến EKB-RES-205) thuộc Resources Pack (Gói 3).</w:t>
       </w:r>
-      <w:bookmarkStart w:id="0" w:name="_GoBack"/>
-      <w:bookmarkEnd w:id="0"/>
     </w:p>
     <w:p>
       <w:pPr>
@@ -1874,6 +1884,248 @@
           <w:bottom w:val="single" w:color="595959" w:sz="6" w:space="1"/>
         </w:pBdr>
         <w:spacing w:before="100" w:after="200"/>
+      </w:pPr>
+    </w:p>
+    <w:p>
+      <w:pPr>
+        <w:spacing w:after="160"/>
+        <w:rPr>
+          <w:rFonts w:ascii="Calibri" w:hAnsi="Calibri" w:eastAsia="Calibri" w:cs="Calibri"/>
+          <w:b w:val="0"/>
+          <w:bCs w:val="0"/>
+          <w:i w:val="0"/>
+          <w:iCs w:val="0"/>
+          <w:color w:val="000000"/>
+          <w:sz w:val="21"/>
+          <w:szCs w:val="21"/>
+        </w:rPr>
+      </w:pPr>
+    </w:p>
+    <w:p>
+      <w:pPr>
+        <w:pStyle w:val="3"/>
+        <w:spacing w:before="320" w:after="160"/>
+      </w:pPr>
+      <w:r>
+        <w:rPr>
+          <w:rFonts w:ascii="Calibri" w:hAnsi="Calibri" w:eastAsia="Calibri" w:cs="Calibri"/>
+          <w:b/>
+          <w:bCs/>
+          <w:color w:val="2E5395"/>
+        </w:rPr>
+        <w:t>[v0.</w:t>
+      </w:r>
+      <w:r>
+        <w:rPr>
+          <w:rFonts w:hint="default" w:ascii="Calibri" w:hAnsi="Calibri" w:eastAsia="Calibri" w:cs="Calibri"/>
+          <w:b/>
+          <w:bCs/>
+          <w:color w:val="2E5395"/>
+          <w:lang w:val="en-US"/>
+        </w:rPr>
+        <w:t>4</w:t>
+      </w:r>
+      <w:r>
+        <w:rPr>
+          <w:rFonts w:ascii="Calibri" w:hAnsi="Calibri" w:eastAsia="Calibri" w:cs="Calibri"/>
+          <w:b/>
+          <w:bCs/>
+          <w:color w:val="2E5395"/>
+        </w:rPr>
+        <w:t xml:space="preserve">.0] - </w:t>
+      </w:r>
+      <w:r>
+        <w:rPr>
+          <w:rFonts w:hint="default" w:ascii="Calibri" w:hAnsi="Calibri" w:eastAsia="Calibri" w:cs="Calibri"/>
+          <w:b/>
+          <w:bCs/>
+          <w:color w:val="2E5395"/>
+          <w:lang w:val="en-US"/>
+        </w:rPr>
+        <w:t>23</w:t>
+      </w:r>
+      <w:r>
+        <w:rPr>
+          <w:rFonts w:ascii="Calibri" w:hAnsi="Calibri" w:eastAsia="Calibri" w:cs="Calibri"/>
+          <w:b/>
+          <w:bCs/>
+          <w:color w:val="2E5395"/>
+        </w:rPr>
+        <w:t xml:space="preserve"> /</w:t>
+      </w:r>
+      <w:r>
+        <w:rPr>
+          <w:rFonts w:hint="default" w:ascii="Calibri" w:hAnsi="Calibri" w:eastAsia="Calibri" w:cs="Calibri"/>
+          <w:b/>
+          <w:bCs/>
+          <w:color w:val="2E5395"/>
+          <w:lang w:val="en-US"/>
+        </w:rPr>
+        <w:t>07</w:t>
+      </w:r>
+      <w:r>
+        <w:rPr>
+          <w:rFonts w:ascii="Calibri" w:hAnsi="Calibri" w:eastAsia="Calibri" w:cs="Calibri"/>
+          <w:b/>
+          <w:bCs/>
+          <w:color w:val="2E5395"/>
+        </w:rPr>
+        <w:t xml:space="preserve"> /2026</w:t>
+      </w:r>
+    </w:p>
+    <w:p>
+      <w:pPr>
+        <w:pStyle w:val="4"/>
+        <w:spacing w:before="240" w:after="120"/>
+      </w:pPr>
+      <w:r>
+        <w:rPr>
+          <w:rFonts w:ascii="Calibri" w:hAnsi="Calibri" w:eastAsia="Calibri" w:cs="Calibri"/>
+          <w:b/>
+          <w:bCs/>
+          <w:color w:val="595959"/>
+        </w:rPr>
+        <w:t>Added</w:t>
+      </w:r>
+    </w:p>
+    <w:p>
+      <w:pPr>
+        <w:pStyle w:val="16"/>
+        <w:numPr>
+          <w:ilvl w:val="0"/>
+          <w:numId w:val="1"/>
+        </w:numPr>
+        <w:spacing w:after="80"/>
+      </w:pPr>
+      <w:r>
+        <w:rPr>
+          <w:rFonts w:hint="default"/>
+        </w:rPr>
+        <w:t>04_Projects/: Khởi tạo 6 Project Templates chuẩn (LED, Platform_Designer, SPI, UART, VGA, HPS) thuộc Project Pack (Gói 4).</w:t>
+      </w:r>
+      <w:bookmarkStart w:id="0" w:name="_GoBack"/>
+      <w:bookmarkEnd w:id="0"/>
+    </w:p>
+    <w:p>
+      <w:pPr>
+        <w:pStyle w:val="4"/>
+        <w:spacing w:before="240" w:after="120"/>
+      </w:pPr>
+      <w:r>
+        <w:rPr>
+          <w:rFonts w:ascii="Calibri" w:hAnsi="Calibri" w:eastAsia="Calibri" w:cs="Calibri"/>
+          <w:b/>
+          <w:bCs/>
+          <w:color w:val="595959"/>
+        </w:rPr>
+        <w:t>Changed</w:t>
+      </w:r>
+    </w:p>
+    <w:p>
+      <w:pPr>
+        <w:spacing w:after="160"/>
+      </w:pPr>
+      <w:r>
+        <w:rPr>
+          <w:rFonts w:ascii="Calibri" w:hAnsi="Calibri" w:eastAsia="Calibri" w:cs="Calibri"/>
+          <w:b w:val="0"/>
+          <w:bCs w:val="0"/>
+          <w:i w:val="0"/>
+          <w:iCs w:val="0"/>
+          <w:color w:val="000000"/>
+          <w:sz w:val="21"/>
+          <w:szCs w:val="21"/>
+        </w:rPr>
+        <w:t>(chưa có)</w:t>
+      </w:r>
+    </w:p>
+    <w:p>
+      <w:pPr>
+        <w:pStyle w:val="4"/>
+        <w:spacing w:before="240" w:after="120"/>
+      </w:pPr>
+      <w:r>
+        <w:rPr>
+          <w:rFonts w:ascii="Calibri" w:hAnsi="Calibri" w:eastAsia="Calibri" w:cs="Calibri"/>
+          <w:b/>
+          <w:bCs/>
+          <w:color w:val="595959"/>
+        </w:rPr>
+        <w:t>Fixed</w:t>
+      </w:r>
+    </w:p>
+    <w:p>
+      <w:pPr>
+        <w:spacing w:after="160"/>
+      </w:pPr>
+      <w:r>
+        <w:rPr>
+          <w:rFonts w:ascii="Calibri" w:hAnsi="Calibri" w:eastAsia="Calibri" w:cs="Calibri"/>
+          <w:b w:val="0"/>
+          <w:bCs w:val="0"/>
+          <w:i w:val="0"/>
+          <w:iCs w:val="0"/>
+          <w:color w:val="000000"/>
+          <w:sz w:val="21"/>
+          <w:szCs w:val="21"/>
+        </w:rPr>
+        <w:t>(chưa có)</w:t>
+      </w:r>
+    </w:p>
+    <w:p>
+      <w:pPr>
+        <w:pStyle w:val="4"/>
+        <w:spacing w:before="240" w:after="120"/>
+      </w:pPr>
+      <w:r>
+        <w:rPr>
+          <w:rFonts w:ascii="Calibri" w:hAnsi="Calibri" w:eastAsia="Calibri" w:cs="Calibri"/>
+          <w:b/>
+          <w:bCs/>
+          <w:color w:val="595959"/>
+        </w:rPr>
+        <w:t>Removed</w:t>
+      </w:r>
+    </w:p>
+    <w:p>
+      <w:pPr>
+        <w:spacing w:after="160"/>
+      </w:pPr>
+      <w:r>
+        <w:rPr>
+          <w:rFonts w:ascii="Calibri" w:hAnsi="Calibri" w:eastAsia="Calibri" w:cs="Calibri"/>
+          <w:b w:val="0"/>
+          <w:bCs w:val="0"/>
+          <w:i w:val="0"/>
+          <w:iCs w:val="0"/>
+          <w:color w:val="000000"/>
+          <w:sz w:val="21"/>
+          <w:szCs w:val="21"/>
+        </w:rPr>
+        <w:t>(chưa có)</w:t>
+      </w:r>
+    </w:p>
+    <w:p>
+      <w:pPr>
+        <w:pBdr>
+          <w:bottom w:val="single" w:color="595959" w:sz="6" w:space="1"/>
+        </w:pBdr>
+        <w:spacing w:before="100" w:after="200"/>
+      </w:pPr>
+    </w:p>
+    <w:p>
+      <w:pPr>
+        <w:spacing w:after="160"/>
+        <w:rPr>
+          <w:rFonts w:ascii="Calibri" w:hAnsi="Calibri" w:eastAsia="Calibri" w:cs="Calibri"/>
+          <w:b w:val="0"/>
+          <w:bCs w:val="0"/>
+          <w:i w:val="0"/>
+          <w:iCs w:val="0"/>
+          <w:color w:val="000000"/>
+          <w:sz w:val="21"/>
+          <w:szCs w:val="21"/>
+        </w:rPr>
       </w:pPr>
     </w:p>
     <w:p>

</xml_diff>

<commit_message>
[Review][v0.5.0] Khởi tạo Review Pack (Gói 5) - 4 Template nghiệm thu
</commit_message>
<xml_diff>
--- a/00_Project_Management/Change Log.docx
+++ b/00_Project_Management/Change Log.docx
@@ -2003,8 +2003,252 @@
         </w:rPr>
         <w:t>04_Projects/: Khởi tạo 6 Project Templates chuẩn (LED, Platform_Designer, SPI, UART, VGA, HPS) thuộc Project Pack (Gói 4).</w:t>
       </w:r>
+    </w:p>
+    <w:p>
+      <w:pPr>
+        <w:pStyle w:val="4"/>
+        <w:spacing w:before="240" w:after="120"/>
+      </w:pPr>
+      <w:r>
+        <w:rPr>
+          <w:rFonts w:ascii="Calibri" w:hAnsi="Calibri" w:eastAsia="Calibri" w:cs="Calibri"/>
+          <w:b/>
+          <w:bCs/>
+          <w:color w:val="595959"/>
+        </w:rPr>
+        <w:t>Changed</w:t>
+      </w:r>
+    </w:p>
+    <w:p>
+      <w:pPr>
+        <w:spacing w:after="160"/>
+      </w:pPr>
+      <w:r>
+        <w:rPr>
+          <w:rFonts w:ascii="Calibri" w:hAnsi="Calibri" w:eastAsia="Calibri" w:cs="Calibri"/>
+          <w:b w:val="0"/>
+          <w:bCs w:val="0"/>
+          <w:i w:val="0"/>
+          <w:iCs w:val="0"/>
+          <w:color w:val="000000"/>
+          <w:sz w:val="21"/>
+          <w:szCs w:val="21"/>
+        </w:rPr>
+        <w:t>(chưa có)</w:t>
+      </w:r>
+    </w:p>
+    <w:p>
+      <w:pPr>
+        <w:pStyle w:val="4"/>
+        <w:spacing w:before="240" w:after="120"/>
+      </w:pPr>
+      <w:r>
+        <w:rPr>
+          <w:rFonts w:ascii="Calibri" w:hAnsi="Calibri" w:eastAsia="Calibri" w:cs="Calibri"/>
+          <w:b/>
+          <w:bCs/>
+          <w:color w:val="595959"/>
+        </w:rPr>
+        <w:t>Fixed</w:t>
+      </w:r>
+    </w:p>
+    <w:p>
+      <w:pPr>
+        <w:spacing w:after="160"/>
+      </w:pPr>
+      <w:r>
+        <w:rPr>
+          <w:rFonts w:ascii="Calibri" w:hAnsi="Calibri" w:eastAsia="Calibri" w:cs="Calibri"/>
+          <w:b w:val="0"/>
+          <w:bCs w:val="0"/>
+          <w:i w:val="0"/>
+          <w:iCs w:val="0"/>
+          <w:color w:val="000000"/>
+          <w:sz w:val="21"/>
+          <w:szCs w:val="21"/>
+        </w:rPr>
+        <w:t>(chưa có)</w:t>
+      </w:r>
+    </w:p>
+    <w:p>
+      <w:pPr>
+        <w:pStyle w:val="4"/>
+        <w:spacing w:before="240" w:after="120"/>
+      </w:pPr>
+      <w:r>
+        <w:rPr>
+          <w:rFonts w:ascii="Calibri" w:hAnsi="Calibri" w:eastAsia="Calibri" w:cs="Calibri"/>
+          <w:b/>
+          <w:bCs/>
+          <w:color w:val="595959"/>
+        </w:rPr>
+        <w:t>Removed</w:t>
+      </w:r>
+    </w:p>
+    <w:p>
+      <w:pPr>
+        <w:spacing w:after="160"/>
+      </w:pPr>
+      <w:r>
+        <w:rPr>
+          <w:rFonts w:ascii="Calibri" w:hAnsi="Calibri" w:eastAsia="Calibri" w:cs="Calibri"/>
+          <w:b w:val="0"/>
+          <w:bCs w:val="0"/>
+          <w:i w:val="0"/>
+          <w:iCs w:val="0"/>
+          <w:color w:val="000000"/>
+          <w:sz w:val="21"/>
+          <w:szCs w:val="21"/>
+        </w:rPr>
+        <w:t>(chưa có)</w:t>
+      </w:r>
+    </w:p>
+    <w:p>
+      <w:pPr>
+        <w:pBdr>
+          <w:bottom w:val="single" w:color="595959" w:sz="6" w:space="1"/>
+        </w:pBdr>
+        <w:spacing w:before="100" w:after="200"/>
+      </w:pPr>
+    </w:p>
+    <w:p>
+      <w:pPr>
+        <w:spacing w:after="160"/>
+        <w:rPr>
+          <w:rFonts w:ascii="Calibri" w:hAnsi="Calibri" w:eastAsia="Calibri" w:cs="Calibri"/>
+          <w:b w:val="0"/>
+          <w:bCs w:val="0"/>
+          <w:i w:val="0"/>
+          <w:iCs w:val="0"/>
+          <w:color w:val="000000"/>
+          <w:sz w:val="21"/>
+          <w:szCs w:val="21"/>
+        </w:rPr>
+      </w:pPr>
+    </w:p>
+    <w:p>
+      <w:pPr>
+        <w:pStyle w:val="3"/>
+        <w:spacing w:before="320" w:after="160"/>
+      </w:pPr>
+      <w:r>
+        <w:rPr>
+          <w:rFonts w:ascii="Calibri" w:hAnsi="Calibri" w:eastAsia="Calibri" w:cs="Calibri"/>
+          <w:b/>
+          <w:bCs/>
+          <w:color w:val="2E5395"/>
+        </w:rPr>
+        <w:t>[v0.</w:t>
+      </w:r>
+      <w:r>
+        <w:rPr>
+          <w:rFonts w:hint="default" w:ascii="Calibri" w:hAnsi="Calibri" w:eastAsia="Calibri" w:cs="Calibri"/>
+          <w:b/>
+          <w:bCs/>
+          <w:color w:val="2E5395"/>
+          <w:lang w:val="en-US"/>
+        </w:rPr>
+        <w:t>5</w:t>
+      </w:r>
+      <w:r>
+        <w:rPr>
+          <w:rFonts w:ascii="Calibri" w:hAnsi="Calibri" w:eastAsia="Calibri" w:cs="Calibri"/>
+          <w:b/>
+          <w:bCs/>
+          <w:color w:val="2E5395"/>
+        </w:rPr>
+        <w:t xml:space="preserve">.0] - </w:t>
+      </w:r>
+      <w:r>
+        <w:rPr>
+          <w:rFonts w:hint="default" w:ascii="Calibri" w:hAnsi="Calibri" w:eastAsia="Calibri" w:cs="Calibri"/>
+          <w:b/>
+          <w:bCs/>
+          <w:color w:val="2E5395"/>
+          <w:lang w:val="en-US"/>
+        </w:rPr>
+        <w:t>23</w:t>
+      </w:r>
+      <w:r>
+        <w:rPr>
+          <w:rFonts w:ascii="Calibri" w:hAnsi="Calibri" w:eastAsia="Calibri" w:cs="Calibri"/>
+          <w:b/>
+          <w:bCs/>
+          <w:color w:val="2E5395"/>
+        </w:rPr>
+        <w:t xml:space="preserve"> /</w:t>
+      </w:r>
+      <w:r>
+        <w:rPr>
+          <w:rFonts w:hint="default" w:ascii="Calibri" w:hAnsi="Calibri" w:eastAsia="Calibri" w:cs="Calibri"/>
+          <w:b/>
+          <w:bCs/>
+          <w:color w:val="2E5395"/>
+          <w:lang w:val="en-US"/>
+        </w:rPr>
+        <w:t>07</w:t>
+      </w:r>
+      <w:r>
+        <w:rPr>
+          <w:rFonts w:ascii="Calibri" w:hAnsi="Calibri" w:eastAsia="Calibri" w:cs="Calibri"/>
+          <w:b/>
+          <w:bCs/>
+          <w:color w:val="2E5395"/>
+        </w:rPr>
+        <w:t xml:space="preserve"> /2026</w:t>
+      </w:r>
       <w:bookmarkStart w:id="0" w:name="_GoBack"/>
       <w:bookmarkEnd w:id="0"/>
+    </w:p>
+    <w:p>
+      <w:pPr>
+        <w:pStyle w:val="4"/>
+        <w:spacing w:before="240" w:after="120"/>
+      </w:pPr>
+      <w:r>
+        <w:rPr>
+          <w:rFonts w:ascii="Calibri" w:hAnsi="Calibri" w:eastAsia="Calibri" w:cs="Calibri"/>
+          <w:b/>
+          <w:bCs/>
+          <w:color w:val="595959"/>
+        </w:rPr>
+        <w:t>Added</w:t>
+      </w:r>
+    </w:p>
+    <w:p>
+      <w:pPr>
+        <w:pStyle w:val="16"/>
+        <w:numPr>
+          <w:ilvl w:val="0"/>
+          <w:numId w:val="1"/>
+        </w:numPr>
+        <w:spacing w:after="80"/>
+        <w:rPr>
+          <w:rFonts w:hint="default"/>
+        </w:rPr>
+      </w:pPr>
+      <w:r>
+        <w:rPr>
+          <w:rFonts w:hint="default"/>
+        </w:rPr>
+        <w:t xml:space="preserve"> 07_Engineering_Assets/Templates/: Thêm 4 mẫu tài liệu kiểm duyệt (EKB-REV-701 đến EKB-REV-704) thuộc Review Pack (Gói 5).</w:t>
+      </w:r>
+    </w:p>
+    <w:p>
+      <w:pPr>
+        <w:pStyle w:val="16"/>
+        <w:numPr>
+          <w:ilvl w:val="0"/>
+          <w:numId w:val="1"/>
+        </w:numPr>
+        <w:spacing w:after="80"/>
+      </w:pPr>
+      <w:r>
+        <w:rPr>
+          <w:rFonts w:hint="default"/>
+        </w:rPr>
+        <w:t>-08_Review/: Tạo thư mục con Release_Notes/.</w:t>
+      </w:r>
     </w:p>
     <w:p>
       <w:pPr>

</xml_diff>

<commit_message>
[Project][v0.6.0] Hoàn thành project LED Chaser & Báo cáo kiểm chứng
</commit_message>
<xml_diff>
--- a/00_Project_Management/Change Log.docx
+++ b/00_Project_Management/Change Log.docx
@@ -2197,8 +2197,6 @@
         </w:rPr>
         <w:t xml:space="preserve"> /2026</w:t>
       </w:r>
-      <w:bookmarkStart w:id="0" w:name="_GoBack"/>
-      <w:bookmarkEnd w:id="0"/>
     </w:p>
     <w:p>
       <w:pPr>
@@ -2282,6 +2280,274 @@
         </w:rPr>
         <w:t>(chưa có)</w:t>
       </w:r>
+    </w:p>
+    <w:p>
+      <w:pPr>
+        <w:pStyle w:val="4"/>
+        <w:spacing w:before="240" w:after="120"/>
+      </w:pPr>
+      <w:r>
+        <w:rPr>
+          <w:rFonts w:ascii="Calibri" w:hAnsi="Calibri" w:eastAsia="Calibri" w:cs="Calibri"/>
+          <w:b/>
+          <w:bCs/>
+          <w:color w:val="595959"/>
+        </w:rPr>
+        <w:t>Fixed</w:t>
+      </w:r>
+    </w:p>
+    <w:p>
+      <w:pPr>
+        <w:spacing w:after="160"/>
+      </w:pPr>
+      <w:r>
+        <w:rPr>
+          <w:rFonts w:ascii="Calibri" w:hAnsi="Calibri" w:eastAsia="Calibri" w:cs="Calibri"/>
+          <w:b w:val="0"/>
+          <w:bCs w:val="0"/>
+          <w:i w:val="0"/>
+          <w:iCs w:val="0"/>
+          <w:color w:val="000000"/>
+          <w:sz w:val="21"/>
+          <w:szCs w:val="21"/>
+        </w:rPr>
+        <w:t>(chưa có)</w:t>
+      </w:r>
+    </w:p>
+    <w:p>
+      <w:pPr>
+        <w:pStyle w:val="4"/>
+        <w:spacing w:before="240" w:after="120"/>
+      </w:pPr>
+      <w:r>
+        <w:rPr>
+          <w:rFonts w:ascii="Calibri" w:hAnsi="Calibri" w:eastAsia="Calibri" w:cs="Calibri"/>
+          <w:b/>
+          <w:bCs/>
+          <w:color w:val="595959"/>
+        </w:rPr>
+        <w:t>Removed</w:t>
+      </w:r>
+    </w:p>
+    <w:p>
+      <w:pPr>
+        <w:spacing w:after="160"/>
+      </w:pPr>
+      <w:r>
+        <w:rPr>
+          <w:rFonts w:ascii="Calibri" w:hAnsi="Calibri" w:eastAsia="Calibri" w:cs="Calibri"/>
+          <w:b w:val="0"/>
+          <w:bCs w:val="0"/>
+          <w:i w:val="0"/>
+          <w:iCs w:val="0"/>
+          <w:color w:val="000000"/>
+          <w:sz w:val="21"/>
+          <w:szCs w:val="21"/>
+        </w:rPr>
+        <w:t>(chưa có)</w:t>
+      </w:r>
+    </w:p>
+    <w:p>
+      <w:pPr>
+        <w:pBdr>
+          <w:bottom w:val="single" w:color="595959" w:sz="6" w:space="1"/>
+        </w:pBdr>
+        <w:spacing w:before="100" w:after="200"/>
+      </w:pPr>
+    </w:p>
+    <w:p>
+      <w:pPr>
+        <w:spacing w:after="160"/>
+        <w:rPr>
+          <w:rFonts w:ascii="Calibri" w:hAnsi="Calibri" w:eastAsia="Calibri" w:cs="Calibri"/>
+          <w:b w:val="0"/>
+          <w:bCs w:val="0"/>
+          <w:i w:val="0"/>
+          <w:iCs w:val="0"/>
+          <w:color w:val="000000"/>
+          <w:sz w:val="21"/>
+          <w:szCs w:val="21"/>
+        </w:rPr>
+      </w:pPr>
+    </w:p>
+    <w:p>
+      <w:pPr>
+        <w:pStyle w:val="3"/>
+        <w:spacing w:before="320" w:after="160"/>
+      </w:pPr>
+      <w:r>
+        <w:rPr>
+          <w:rFonts w:ascii="Calibri" w:hAnsi="Calibri" w:eastAsia="Calibri" w:cs="Calibri"/>
+          <w:b/>
+          <w:bCs/>
+          <w:color w:val="2E5395"/>
+        </w:rPr>
+        <w:t>[v0.</w:t>
+      </w:r>
+      <w:r>
+        <w:rPr>
+          <w:rFonts w:hint="default" w:cs="Calibri"/>
+          <w:b/>
+          <w:bCs/>
+          <w:color w:val="2E5395"/>
+          <w:lang w:val="en-US"/>
+        </w:rPr>
+        <w:t>6</w:t>
+      </w:r>
+      <w:r>
+        <w:rPr>
+          <w:rFonts w:ascii="Calibri" w:hAnsi="Calibri" w:eastAsia="Calibri" w:cs="Calibri"/>
+          <w:b/>
+          <w:bCs/>
+          <w:color w:val="2E5395"/>
+        </w:rPr>
+        <w:t xml:space="preserve">.0] - </w:t>
+      </w:r>
+      <w:r>
+        <w:rPr>
+          <w:rFonts w:hint="default" w:ascii="Calibri" w:hAnsi="Calibri" w:eastAsia="Calibri" w:cs="Calibri"/>
+          <w:b/>
+          <w:bCs/>
+          <w:color w:val="2E5395"/>
+          <w:lang w:val="en-US"/>
+        </w:rPr>
+        <w:t>23</w:t>
+      </w:r>
+      <w:r>
+        <w:rPr>
+          <w:rFonts w:ascii="Calibri" w:hAnsi="Calibri" w:eastAsia="Calibri" w:cs="Calibri"/>
+          <w:b/>
+          <w:bCs/>
+          <w:color w:val="2E5395"/>
+        </w:rPr>
+        <w:t xml:space="preserve"> /</w:t>
+      </w:r>
+      <w:r>
+        <w:rPr>
+          <w:rFonts w:hint="default" w:ascii="Calibri" w:hAnsi="Calibri" w:eastAsia="Calibri" w:cs="Calibri"/>
+          <w:b/>
+          <w:bCs/>
+          <w:color w:val="2E5395"/>
+          <w:lang w:val="en-US"/>
+        </w:rPr>
+        <w:t>07</w:t>
+      </w:r>
+      <w:r>
+        <w:rPr>
+          <w:rFonts w:ascii="Calibri" w:hAnsi="Calibri" w:eastAsia="Calibri" w:cs="Calibri"/>
+          <w:b/>
+          <w:bCs/>
+          <w:color w:val="2E5395"/>
+        </w:rPr>
+        <w:t xml:space="preserve"> /2026</w:t>
+      </w:r>
+    </w:p>
+    <w:p>
+      <w:pPr>
+        <w:pStyle w:val="4"/>
+        <w:spacing w:before="240" w:after="120"/>
+      </w:pPr>
+      <w:r>
+        <w:rPr>
+          <w:rFonts w:ascii="Calibri" w:hAnsi="Calibri" w:eastAsia="Calibri" w:cs="Calibri"/>
+          <w:b/>
+          <w:bCs/>
+          <w:color w:val="595959"/>
+        </w:rPr>
+        <w:t>Added</w:t>
+      </w:r>
+    </w:p>
+    <w:p>
+      <w:pPr>
+        <w:pStyle w:val="16"/>
+        <w:numPr>
+          <w:ilvl w:val="0"/>
+          <w:numId w:val="1"/>
+        </w:numPr>
+        <w:spacing w:after="80"/>
+        <w:rPr>
+          <w:rFonts w:hint="default"/>
+        </w:rPr>
+      </w:pPr>
+      <w:r>
+        <w:rPr>
+          <w:rFonts w:hint="default"/>
+        </w:rPr>
+        <w:t xml:space="preserve"> 03_Resources/: Thêm Verification_Report_LED.docx</w:t>
+      </w:r>
+    </w:p>
+    <w:p>
+      <w:pPr>
+        <w:pStyle w:val="4"/>
+        <w:spacing w:before="240" w:after="120"/>
+      </w:pPr>
+      <w:r>
+        <w:rPr>
+          <w:rFonts w:ascii="Calibri" w:hAnsi="Calibri" w:eastAsia="Calibri" w:cs="Calibri"/>
+          <w:b/>
+          <w:bCs/>
+          <w:color w:val="595959"/>
+        </w:rPr>
+        <w:t>Changed</w:t>
+      </w:r>
+    </w:p>
+    <w:p>
+      <w:pPr>
+        <w:pStyle w:val="16"/>
+        <w:numPr>
+          <w:ilvl w:val="0"/>
+          <w:numId w:val="1"/>
+        </w:numPr>
+        <w:spacing w:after="80"/>
+        <w:rPr>
+          <w:rFonts w:hint="default"/>
+        </w:rPr>
+      </w:pPr>
+      <w:r>
+        <w:rPr>
+          <w:rFonts w:hint="default"/>
+        </w:rPr>
+        <w:t>04_Projects/LED/: Hoàn thiện RTL code (led_chaser.v, clk_divider.v), Testbench, Quartus Project, và chạy thành công trên board thật.</w:t>
+      </w:r>
+    </w:p>
+    <w:p>
+      <w:pPr>
+        <w:pStyle w:val="16"/>
+        <w:numPr>
+          <w:ilvl w:val="0"/>
+          <w:numId w:val="1"/>
+        </w:numPr>
+        <w:spacing w:after="80"/>
+        <w:rPr>
+          <w:rFonts w:hint="default"/>
+        </w:rPr>
+      </w:pPr>
+      <w:r>
+        <w:rPr>
+          <w:rFonts w:hint="default"/>
+        </w:rPr>
+        <w:t>-</w:t>
+      </w:r>
+      <w:bookmarkStart w:id="0" w:name="_GoBack"/>
+      <w:bookmarkEnd w:id="0"/>
+      <w:r>
+        <w:rPr>
+          <w:rFonts w:hint="default"/>
+        </w:rPr>
+        <w:t>02_Handbook/Volume II_Core_Logic_and_RTL.docx: Cập nhật trạng thái hoàn thành 100% cho Chương 2 (FSM).</w:t>
+      </w:r>
+    </w:p>
+    <w:p>
+      <w:pPr>
+        <w:pStyle w:val="4"/>
+        <w:spacing w:before="240" w:after="120"/>
+        <w:rPr>
+          <w:rFonts w:ascii="Calibri" w:hAnsi="Calibri" w:eastAsia="Calibri" w:cs="Calibri"/>
+          <w:b/>
+          <w:bCs/>
+          <w:color w:val="595959"/>
+        </w:rPr>
+      </w:pPr>
     </w:p>
     <w:p>
       <w:pPr>

</xml_diff>

<commit_message>
[Project][v0.6.0] Hoàn thành project hps_pio dùng dtb và rbf trên hps và thêm 2 file hướng dẫn cần thiết cho HPS
</commit_message>
<xml_diff>
--- a/00_Project_Management/Change Log.docx
+++ b/00_Project_Management/Change Log.docx
@@ -2526,15 +2526,7 @@
         <w:rPr>
           <w:rFonts w:hint="default"/>
         </w:rPr>
-        <w:t>-</w:t>
-      </w:r>
-      <w:bookmarkStart w:id="0" w:name="_GoBack"/>
-      <w:bookmarkEnd w:id="0"/>
-      <w:r>
-        <w:rPr>
-          <w:rFonts w:hint="default"/>
-        </w:rPr>
-        <w:t>02_Handbook/Volume II_Core_Logic_and_RTL.docx: Cập nhật trạng thái hoàn thành 100% cho Chương 2 (FSM).</w:t>
+        <w:t>-02_Handbook/Volume II_Core_Logic_and_RTL.docx: Cập nhật trạng thái hoàn thành 100% cho Chương 2 (FSM).</w:t>
       </w:r>
     </w:p>
     <w:p>
@@ -2637,6 +2629,565 @@
           <w:szCs w:val="21"/>
         </w:rPr>
       </w:pPr>
+    </w:p>
+    <w:p>
+      <w:pPr>
+        <w:pStyle w:val="3"/>
+        <w:spacing w:before="320" w:after="160"/>
+      </w:pPr>
+      <w:r>
+        <w:rPr>
+          <w:rFonts w:ascii="Calibri" w:hAnsi="Calibri" w:eastAsia="Calibri" w:cs="Calibri"/>
+          <w:b/>
+          <w:bCs/>
+          <w:color w:val="2E5395"/>
+        </w:rPr>
+        <w:t>[v0.</w:t>
+      </w:r>
+      <w:r>
+        <w:rPr>
+          <w:rFonts w:hint="default" w:cs="Calibri"/>
+          <w:b/>
+          <w:bCs/>
+          <w:color w:val="2E5395"/>
+          <w:lang w:val="en-US"/>
+        </w:rPr>
+        <w:t>6</w:t>
+      </w:r>
+      <w:r>
+        <w:rPr>
+          <w:rFonts w:ascii="Calibri" w:hAnsi="Calibri" w:eastAsia="Calibri" w:cs="Calibri"/>
+          <w:b/>
+          <w:bCs/>
+          <w:color w:val="2E5395"/>
+        </w:rPr>
+        <w:t xml:space="preserve">.0] - </w:t>
+      </w:r>
+      <w:r>
+        <w:rPr>
+          <w:rFonts w:hint="default" w:ascii="Calibri" w:hAnsi="Calibri" w:eastAsia="Calibri" w:cs="Calibri"/>
+          <w:b/>
+          <w:bCs/>
+          <w:color w:val="2E5395"/>
+          <w:lang w:val="en-US"/>
+        </w:rPr>
+        <w:t>0</w:t>
+      </w:r>
+      <w:r>
+        <w:rPr>
+          <w:rFonts w:hint="default" w:cs="Calibri"/>
+          <w:b/>
+          <w:bCs/>
+          <w:color w:val="2E5395"/>
+          <w:lang w:val="vi-VN"/>
+        </w:rPr>
+        <w:t>6</w:t>
+      </w:r>
+      <w:r>
+        <w:rPr>
+          <w:rFonts w:ascii="Calibri" w:hAnsi="Calibri" w:eastAsia="Calibri" w:cs="Calibri"/>
+          <w:b/>
+          <w:bCs/>
+          <w:color w:val="2E5395"/>
+        </w:rPr>
+        <w:t xml:space="preserve"> /</w:t>
+      </w:r>
+      <w:r>
+        <w:rPr>
+          <w:rFonts w:hint="default" w:ascii="Calibri" w:hAnsi="Calibri" w:eastAsia="Calibri" w:cs="Calibri"/>
+          <w:b/>
+          <w:bCs/>
+          <w:color w:val="2E5395"/>
+          <w:lang w:val="en-US"/>
+        </w:rPr>
+        <w:t>08</w:t>
+      </w:r>
+      <w:r>
+        <w:rPr>
+          <w:rFonts w:ascii="Calibri" w:hAnsi="Calibri" w:eastAsia="Calibri" w:cs="Calibri"/>
+          <w:b/>
+          <w:bCs/>
+          <w:color w:val="2E5395"/>
+        </w:rPr>
+        <w:t xml:space="preserve"> /2026</w:t>
+      </w:r>
+    </w:p>
+    <w:p>
+      <w:pPr>
+        <w:pStyle w:val="4"/>
+        <w:spacing w:before="240" w:after="120"/>
+      </w:pPr>
+      <w:r>
+        <w:rPr>
+          <w:rFonts w:ascii="Calibri" w:hAnsi="Calibri" w:eastAsia="Calibri" w:cs="Calibri"/>
+          <w:b/>
+          <w:bCs/>
+          <w:color w:val="595959"/>
+        </w:rPr>
+        <w:t>Added</w:t>
+      </w:r>
+    </w:p>
+    <w:p>
+      <w:pPr>
+        <w:pStyle w:val="16"/>
+        <w:numPr>
+          <w:ilvl w:val="0"/>
+          <w:numId w:val="1"/>
+        </w:numPr>
+        <w:spacing w:after="80"/>
+        <w:rPr>
+          <w:rFonts w:hint="default"/>
+        </w:rPr>
+      </w:pPr>
+      <w:r>
+        <w:rPr>
+          <w:rFonts w:hint="default"/>
+        </w:rPr>
+        <w:t>Tích hợp thành công phần cứng hệ thống SoC (HPS) thông qua Platform Designer (Qsys).</w:t>
+      </w:r>
+    </w:p>
+    <w:p>
+      <w:pPr>
+        <w:pStyle w:val="16"/>
+        <w:numPr>
+          <w:ilvl w:val="0"/>
+          <w:numId w:val="1"/>
+        </w:numPr>
+        <w:spacing w:after="80"/>
+        <w:rPr>
+          <w:rFonts w:hint="default"/>
+        </w:rPr>
+      </w:pPr>
+      <w:r>
+        <w:rPr>
+          <w:rFonts w:hint="default"/>
+        </w:rPr>
+        <w:t>Generate và trích xuất thành công các file phục vụ khởi động Linux: soc_system.dts, soc_system.dtb, và u-boot.scr.</w:t>
+      </w:r>
+    </w:p>
+    <w:p>
+      <w:pPr>
+        <w:pStyle w:val="16"/>
+        <w:numPr>
+          <w:ilvl w:val="0"/>
+          <w:numId w:val="1"/>
+        </w:numPr>
+        <w:spacing w:after="80"/>
+        <w:rPr>
+          <w:rFonts w:hint="default"/>
+        </w:rPr>
+      </w:pPr>
+      <w:r>
+        <w:rPr>
+          <w:rFonts w:hint="default"/>
+        </w:rPr>
+        <w:t>Tạo thư mục mới 04_Projects\HPS\Linux_Boot\ để chứa cấu hình phần mềm boot HPS.</w:t>
+      </w:r>
+    </w:p>
+    <w:p>
+      <w:pPr>
+        <w:pStyle w:val="4"/>
+        <w:spacing w:before="240" w:after="120"/>
+      </w:pPr>
+      <w:r>
+        <w:rPr>
+          <w:rFonts w:ascii="Calibri" w:hAnsi="Calibri" w:eastAsia="Calibri" w:cs="Calibri"/>
+          <w:b/>
+          <w:bCs/>
+          <w:color w:val="595959"/>
+        </w:rPr>
+        <w:t>Changed</w:t>
+      </w:r>
+    </w:p>
+    <w:p>
+      <w:pPr>
+        <w:pStyle w:val="16"/>
+        <w:numPr>
+          <w:ilvl w:val="0"/>
+          <w:numId w:val="1"/>
+        </w:numPr>
+        <w:spacing w:after="80"/>
+        <w:rPr>
+          <w:rFonts w:hint="default"/>
+        </w:rPr>
+      </w:pPr>
+      <w:r>
+        <w:rPr>
+          <w:rFonts w:hint="default"/>
+        </w:rPr>
+        <w:t>Hoàn thiện nội dung Volume V_SoC_and_Platform_Designer.docx.</w:t>
+      </w:r>
+    </w:p>
+    <w:p>
+      <w:pPr>
+        <w:pStyle w:val="4"/>
+        <w:spacing w:before="240" w:after="120"/>
+        <w:rPr>
+          <w:rFonts w:ascii="Calibri" w:hAnsi="Calibri" w:eastAsia="Calibri" w:cs="Calibri"/>
+          <w:b/>
+          <w:bCs/>
+          <w:color w:val="595959"/>
+        </w:rPr>
+      </w:pPr>
+    </w:p>
+    <w:p>
+      <w:pPr>
+        <w:pStyle w:val="4"/>
+        <w:spacing w:before="240" w:after="120"/>
+      </w:pPr>
+      <w:r>
+        <w:rPr>
+          <w:rFonts w:ascii="Calibri" w:hAnsi="Calibri" w:eastAsia="Calibri" w:cs="Calibri"/>
+          <w:b/>
+          <w:bCs/>
+          <w:color w:val="595959"/>
+        </w:rPr>
+        <w:t>Fixed</w:t>
+      </w:r>
+    </w:p>
+    <w:p>
+      <w:pPr>
+        <w:spacing w:after="160"/>
+      </w:pPr>
+      <w:r>
+        <w:rPr>
+          <w:rFonts w:ascii="Calibri" w:hAnsi="Calibri" w:eastAsia="Calibri" w:cs="Calibri"/>
+          <w:b w:val="0"/>
+          <w:bCs w:val="0"/>
+          <w:i w:val="0"/>
+          <w:iCs w:val="0"/>
+          <w:color w:val="000000"/>
+          <w:sz w:val="21"/>
+          <w:szCs w:val="21"/>
+        </w:rPr>
+        <w:t>(chưa có)</w:t>
+      </w:r>
+    </w:p>
+    <w:p>
+      <w:pPr>
+        <w:pStyle w:val="4"/>
+        <w:spacing w:before="240" w:after="120"/>
+      </w:pPr>
+      <w:r>
+        <w:rPr>
+          <w:rFonts w:ascii="Calibri" w:hAnsi="Calibri" w:eastAsia="Calibri" w:cs="Calibri"/>
+          <w:b/>
+          <w:bCs/>
+          <w:color w:val="595959"/>
+        </w:rPr>
+        <w:t>Removed</w:t>
+      </w:r>
+    </w:p>
+    <w:p>
+      <w:pPr>
+        <w:spacing w:after="160"/>
+      </w:pPr>
+      <w:r>
+        <w:rPr>
+          <w:rFonts w:ascii="Calibri" w:hAnsi="Calibri" w:eastAsia="Calibri" w:cs="Calibri"/>
+          <w:b w:val="0"/>
+          <w:bCs w:val="0"/>
+          <w:i w:val="0"/>
+          <w:iCs w:val="0"/>
+          <w:color w:val="000000"/>
+          <w:sz w:val="21"/>
+          <w:szCs w:val="21"/>
+        </w:rPr>
+        <w:t>(chưa có)</w:t>
+      </w:r>
+    </w:p>
+    <w:p>
+      <w:pPr>
+        <w:pBdr>
+          <w:bottom w:val="single" w:color="595959" w:sz="6" w:space="1"/>
+        </w:pBdr>
+        <w:spacing w:before="100" w:after="200"/>
+      </w:pPr>
+    </w:p>
+    <w:p>
+      <w:pPr>
+        <w:spacing w:after="160"/>
+        <w:rPr>
+          <w:rFonts w:ascii="Calibri" w:hAnsi="Calibri" w:eastAsia="Calibri" w:cs="Calibri"/>
+          <w:b w:val="0"/>
+          <w:bCs w:val="0"/>
+          <w:i w:val="0"/>
+          <w:iCs w:val="0"/>
+          <w:color w:val="000000"/>
+          <w:sz w:val="21"/>
+          <w:szCs w:val="21"/>
+        </w:rPr>
+      </w:pPr>
+    </w:p>
+    <w:p>
+      <w:pPr>
+        <w:pStyle w:val="3"/>
+        <w:spacing w:before="320" w:after="160"/>
+      </w:pPr>
+      <w:r>
+        <w:rPr>
+          <w:rFonts w:ascii="Calibri" w:hAnsi="Calibri" w:eastAsia="Calibri" w:cs="Calibri"/>
+          <w:b/>
+          <w:bCs/>
+          <w:color w:val="2E5395"/>
+        </w:rPr>
+        <w:t>[v0.</w:t>
+      </w:r>
+      <w:r>
+        <w:rPr>
+          <w:rFonts w:hint="default" w:cs="Calibri"/>
+          <w:b/>
+          <w:bCs/>
+          <w:color w:val="2E5395"/>
+          <w:lang w:val="en-US"/>
+        </w:rPr>
+        <w:t>6</w:t>
+      </w:r>
+      <w:r>
+        <w:rPr>
+          <w:rFonts w:ascii="Calibri" w:hAnsi="Calibri" w:eastAsia="Calibri" w:cs="Calibri"/>
+          <w:b/>
+          <w:bCs/>
+          <w:color w:val="2E5395"/>
+        </w:rPr>
+        <w:t xml:space="preserve">.0] - </w:t>
+      </w:r>
+      <w:r>
+        <w:rPr>
+          <w:rFonts w:hint="default" w:ascii="Calibri" w:hAnsi="Calibri" w:eastAsia="Calibri" w:cs="Calibri"/>
+          <w:b/>
+          <w:bCs/>
+          <w:color w:val="2E5395"/>
+          <w:lang w:val="en-US"/>
+        </w:rPr>
+        <w:t>0</w:t>
+      </w:r>
+      <w:r>
+        <w:rPr>
+          <w:rFonts w:hint="default" w:cs="Calibri"/>
+          <w:b/>
+          <w:bCs/>
+          <w:color w:val="2E5395"/>
+          <w:lang w:val="vi-VN"/>
+        </w:rPr>
+        <w:t>7</w:t>
+      </w:r>
+      <w:r>
+        <w:rPr>
+          <w:rFonts w:ascii="Calibri" w:hAnsi="Calibri" w:eastAsia="Calibri" w:cs="Calibri"/>
+          <w:b/>
+          <w:bCs/>
+          <w:color w:val="2E5395"/>
+        </w:rPr>
+        <w:t xml:space="preserve"> /</w:t>
+      </w:r>
+      <w:r>
+        <w:rPr>
+          <w:rFonts w:hint="default" w:ascii="Calibri" w:hAnsi="Calibri" w:eastAsia="Calibri" w:cs="Calibri"/>
+          <w:b/>
+          <w:bCs/>
+          <w:color w:val="2E5395"/>
+          <w:lang w:val="en-US"/>
+        </w:rPr>
+        <w:t>08</w:t>
+      </w:r>
+      <w:r>
+        <w:rPr>
+          <w:rFonts w:ascii="Calibri" w:hAnsi="Calibri" w:eastAsia="Calibri" w:cs="Calibri"/>
+          <w:b/>
+          <w:bCs/>
+          <w:color w:val="2E5395"/>
+        </w:rPr>
+        <w:t xml:space="preserve"> /2026</w:t>
+      </w:r>
+    </w:p>
+    <w:p>
+      <w:pPr>
+        <w:pStyle w:val="4"/>
+        <w:spacing w:before="240" w:after="120"/>
+      </w:pPr>
+      <w:r>
+        <w:rPr>
+          <w:rFonts w:ascii="Calibri" w:hAnsi="Calibri" w:eastAsia="Calibri" w:cs="Calibri"/>
+          <w:b/>
+          <w:bCs/>
+          <w:color w:val="595959"/>
+        </w:rPr>
+        <w:t>Added</w:t>
+      </w:r>
+    </w:p>
+    <w:p>
+      <w:pPr>
+        <w:pStyle w:val="16"/>
+        <w:numPr>
+          <w:ilvl w:val="0"/>
+          <w:numId w:val="1"/>
+        </w:numPr>
+        <w:spacing w:after="80"/>
+        <w:rPr>
+          <w:rFonts w:hint="default"/>
+        </w:rPr>
+      </w:pPr>
+      <w:r>
+        <w:rPr>
+          <w:rFonts w:hint="default"/>
+          <w:lang w:val="vi-VN"/>
+        </w:rPr>
+        <w:t>T</w:t>
+      </w:r>
+      <w:r>
+        <w:rPr>
+          <w:rFonts w:hint="default"/>
+        </w:rPr>
+        <w:t>hêm 2 tài liệu hướng dẫn tra cứu địa chỉ GPIO/PIO trên Linux và quy trình tạo Device Tree/Boot SD Card vào thư mục 03_Resources/Guides/.</w:t>
+      </w:r>
+    </w:p>
+    <w:p>
+      <w:pPr>
+        <w:pStyle w:val="4"/>
+        <w:spacing w:before="240" w:after="120"/>
+        <w:rPr>
+          <w:rFonts w:ascii="Calibri" w:hAnsi="Calibri" w:eastAsia="Calibri" w:cs="Calibri"/>
+          <w:b/>
+          <w:bCs/>
+          <w:color w:val="595959"/>
+        </w:rPr>
+      </w:pPr>
+      <w:r>
+        <w:rPr>
+          <w:rFonts w:ascii="Calibri" w:hAnsi="Calibri" w:eastAsia="Calibri" w:cs="Calibri"/>
+          <w:b/>
+          <w:bCs/>
+          <w:color w:val="595959"/>
+        </w:rPr>
+        <w:t>Changed</w:t>
+      </w:r>
+    </w:p>
+    <w:p>
+      <w:pPr>
+        <w:rPr>
+          <w:rFonts w:hint="default"/>
+          <w:b w:val="0"/>
+          <w:bCs w:val="0"/>
+          <w:lang w:val="vi-VN"/>
+        </w:rPr>
+      </w:pPr>
+      <w:r>
+        <w:rPr>
+          <w:rFonts w:hint="default" w:cs="Calibri"/>
+          <w:b w:val="0"/>
+          <w:bCs w:val="0"/>
+          <w:color w:val="595959"/>
+          <w:lang w:val="vi-VN"/>
+        </w:rPr>
+        <w:t>(chưa có)</w:t>
+      </w:r>
+    </w:p>
+    <w:p>
+      <w:pPr>
+        <w:pStyle w:val="4"/>
+        <w:spacing w:before="240" w:after="120"/>
+      </w:pPr>
+      <w:r>
+        <w:rPr>
+          <w:rFonts w:ascii="Calibri" w:hAnsi="Calibri" w:eastAsia="Calibri" w:cs="Calibri"/>
+          <w:b/>
+          <w:bCs/>
+          <w:color w:val="595959"/>
+        </w:rPr>
+        <w:t>Fixed</w:t>
+      </w:r>
+    </w:p>
+    <w:p>
+      <w:pPr>
+        <w:spacing w:after="160"/>
+      </w:pPr>
+      <w:r>
+        <w:rPr>
+          <w:rFonts w:ascii="Calibri" w:hAnsi="Calibri" w:eastAsia="Calibri" w:cs="Calibri"/>
+          <w:b w:val="0"/>
+          <w:bCs w:val="0"/>
+          <w:i w:val="0"/>
+          <w:iCs w:val="0"/>
+          <w:color w:val="000000"/>
+          <w:sz w:val="21"/>
+          <w:szCs w:val="21"/>
+        </w:rPr>
+        <w:t>(chưa có)</w:t>
+      </w:r>
+    </w:p>
+    <w:p>
+      <w:pPr>
+        <w:pStyle w:val="4"/>
+        <w:spacing w:before="240" w:after="120"/>
+      </w:pPr>
+      <w:r>
+        <w:rPr>
+          <w:rFonts w:ascii="Calibri" w:hAnsi="Calibri" w:eastAsia="Calibri" w:cs="Calibri"/>
+          <w:b/>
+          <w:bCs/>
+          <w:color w:val="595959"/>
+        </w:rPr>
+        <w:t>Removed</w:t>
+      </w:r>
+    </w:p>
+    <w:p>
+      <w:pPr>
+        <w:spacing w:after="160"/>
+      </w:pPr>
+      <w:r>
+        <w:rPr>
+          <w:rFonts w:ascii="Calibri" w:hAnsi="Calibri" w:eastAsia="Calibri" w:cs="Calibri"/>
+          <w:b w:val="0"/>
+          <w:bCs w:val="0"/>
+          <w:i w:val="0"/>
+          <w:iCs w:val="0"/>
+          <w:color w:val="000000"/>
+          <w:sz w:val="21"/>
+          <w:szCs w:val="21"/>
+        </w:rPr>
+        <w:t>(chưa có)</w:t>
+      </w:r>
+    </w:p>
+    <w:p>
+      <w:pPr>
+        <w:pBdr>
+          <w:bottom w:val="single" w:color="595959" w:sz="6" w:space="1"/>
+        </w:pBdr>
+        <w:spacing w:before="100" w:after="200"/>
+      </w:pPr>
+    </w:p>
+    <w:p>
+      <w:pPr>
+        <w:spacing w:after="160"/>
+        <w:rPr>
+          <w:rFonts w:ascii="Calibri" w:hAnsi="Calibri" w:eastAsia="Calibri" w:cs="Calibri"/>
+          <w:b w:val="0"/>
+          <w:bCs w:val="0"/>
+          <w:i w:val="0"/>
+          <w:iCs w:val="0"/>
+          <w:color w:val="000000"/>
+          <w:sz w:val="21"/>
+          <w:szCs w:val="21"/>
+        </w:rPr>
+      </w:pPr>
+    </w:p>
+    <w:p>
+      <w:pPr>
+        <w:spacing w:after="160"/>
+        <w:rPr>
+          <w:rFonts w:ascii="Calibri" w:hAnsi="Calibri" w:eastAsia="Calibri" w:cs="Calibri"/>
+          <w:b w:val="0"/>
+          <w:bCs w:val="0"/>
+          <w:i w:val="0"/>
+          <w:iCs w:val="0"/>
+          <w:color w:val="000000"/>
+          <w:sz w:val="21"/>
+          <w:szCs w:val="21"/>
+        </w:rPr>
+      </w:pPr>
+      <w:bookmarkStart w:id="0" w:name="_GoBack"/>
+      <w:bookmarkEnd w:id="0"/>
     </w:p>
     <w:p>
       <w:pPr>
@@ -2995,7 +3546,7 @@
     <w:lsdException w:qFormat="1" w:unhideWhenUsed="0" w:uiPriority="0" w:semiHidden="0" w:name="Title"/>
     <w:lsdException w:unhideWhenUsed="0" w:uiPriority="0" w:semiHidden="0" w:name="Closing"/>
     <w:lsdException w:unhideWhenUsed="0" w:uiPriority="0" w:semiHidden="0" w:name="Signature"/>
-    <w:lsdException w:unhideWhenUsed="0" w:uiPriority="0" w:name="Default Paragraph Font"/>
+    <w:lsdException w:qFormat="1" w:unhideWhenUsed="0" w:uiPriority="0" w:name="Default Paragraph Font"/>
     <w:lsdException w:unhideWhenUsed="0" w:uiPriority="0" w:semiHidden="0" w:name="Body Text"/>
     <w:lsdException w:unhideWhenUsed="0" w:uiPriority="0" w:semiHidden="0" w:name="Body Text Indent"/>
     <w:lsdException w:unhideWhenUsed="0" w:uiPriority="0" w:semiHidden="0" w:name="List Continue"/>
@@ -3282,6 +3833,7 @@
   <w:style w:type="character" w:default="1" w:styleId="8">
     <w:name w:val="Default Paragraph Font"/>
     <w:semiHidden/>
+    <w:qFormat/>
     <w:uiPriority w:val="0"/>
   </w:style>
   <w:style w:type="table" w:default="1" w:styleId="9">

</xml_diff>

<commit_message>
[Project][v0.7.0] Hoàn thành project UART
</commit_message>
<xml_diff>
--- a/00_Project_Management/Change Log.docx
+++ b/00_Project_Management/Change Log.docx
@@ -388,7 +388,14 @@
                 <w:rFonts w:hint="default"/>
                 <w:lang w:val="en-US"/>
               </w:rPr>
-              <w:t>Nguyen Gia Huy</w:t>
+              <w:t>Ng</w:t>
+            </w:r>
+            <w:r>
+              <w:rPr>
+                <w:rFonts w:hint="default"/>
+                <w:lang w:val="vi-VN"/>
+              </w:rPr>
+              <w:t>uyễn Gia Huy</w:t>
             </w:r>
           </w:p>
         </w:tc>
@@ -3186,8 +3193,365 @@
           <w:szCs w:val="21"/>
         </w:rPr>
       </w:pPr>
+    </w:p>
+    <w:p>
+      <w:pPr>
+        <w:spacing w:after="160"/>
+        <w:rPr>
+          <w:rFonts w:ascii="Calibri" w:hAnsi="Calibri" w:eastAsia="Calibri" w:cs="Calibri"/>
+          <w:b w:val="0"/>
+          <w:bCs w:val="0"/>
+          <w:i w:val="0"/>
+          <w:iCs w:val="0"/>
+          <w:color w:val="000000"/>
+          <w:sz w:val="21"/>
+          <w:szCs w:val="21"/>
+        </w:rPr>
+      </w:pPr>
+    </w:p>
+    <w:p>
+      <w:pPr>
+        <w:pStyle w:val="3"/>
+        <w:spacing w:before="320" w:after="160"/>
+      </w:pPr>
+      <w:r>
+        <w:rPr>
+          <w:rFonts w:ascii="Calibri" w:hAnsi="Calibri" w:eastAsia="Calibri" w:cs="Calibri"/>
+          <w:b/>
+          <w:bCs/>
+          <w:color w:val="2E5395"/>
+        </w:rPr>
+        <w:t>[v0.</w:t>
+      </w:r>
+      <w:r>
+        <w:rPr>
+          <w:rFonts w:hint="default" w:cs="Calibri"/>
+          <w:b/>
+          <w:bCs/>
+          <w:color w:val="2E5395"/>
+          <w:lang w:val="en-US"/>
+        </w:rPr>
+        <w:t>6</w:t>
+      </w:r>
+      <w:r>
+        <w:rPr>
+          <w:rFonts w:ascii="Calibri" w:hAnsi="Calibri" w:eastAsia="Calibri" w:cs="Calibri"/>
+          <w:b/>
+          <w:bCs/>
+          <w:color w:val="2E5395"/>
+        </w:rPr>
+        <w:t xml:space="preserve">.0] - </w:t>
+      </w:r>
+      <w:r>
+        <w:rPr>
+          <w:rFonts w:hint="default" w:ascii="Calibri" w:hAnsi="Calibri" w:eastAsia="Calibri" w:cs="Calibri"/>
+          <w:b/>
+          <w:bCs/>
+          <w:color w:val="2E5395"/>
+          <w:lang w:val="en-US"/>
+        </w:rPr>
+        <w:t>0</w:t>
+      </w:r>
+      <w:r>
+        <w:rPr>
+          <w:rFonts w:hint="default" w:cs="Calibri"/>
+          <w:b/>
+          <w:bCs/>
+          <w:color w:val="2E5395"/>
+          <w:lang w:val="vi-VN"/>
+        </w:rPr>
+        <w:t>7</w:t>
+      </w:r>
+      <w:r>
+        <w:rPr>
+          <w:rFonts w:ascii="Calibri" w:hAnsi="Calibri" w:eastAsia="Calibri" w:cs="Calibri"/>
+          <w:b/>
+          <w:bCs/>
+          <w:color w:val="2E5395"/>
+        </w:rPr>
+        <w:t xml:space="preserve"> /</w:t>
+      </w:r>
+      <w:r>
+        <w:rPr>
+          <w:rFonts w:hint="default" w:ascii="Calibri" w:hAnsi="Calibri" w:eastAsia="Calibri" w:cs="Calibri"/>
+          <w:b/>
+          <w:bCs/>
+          <w:color w:val="2E5395"/>
+          <w:lang w:val="en-US"/>
+        </w:rPr>
+        <w:t>08</w:t>
+      </w:r>
+      <w:r>
+        <w:rPr>
+          <w:rFonts w:ascii="Calibri" w:hAnsi="Calibri" w:eastAsia="Calibri" w:cs="Calibri"/>
+          <w:b/>
+          <w:bCs/>
+          <w:color w:val="2E5395"/>
+        </w:rPr>
+        <w:t xml:space="preserve"> /2026</w:t>
+      </w:r>
+    </w:p>
+    <w:p>
+      <w:pPr>
+        <w:pStyle w:val="4"/>
+        <w:spacing w:before="240" w:after="120"/>
+      </w:pPr>
+      <w:r>
+        <w:rPr>
+          <w:rFonts w:ascii="Calibri" w:hAnsi="Calibri" w:eastAsia="Calibri" w:cs="Calibri"/>
+          <w:b/>
+          <w:bCs/>
+          <w:color w:val="595959"/>
+        </w:rPr>
+        <w:t>Added</w:t>
+      </w:r>
+    </w:p>
+    <w:p>
+      <w:pPr>
+        <w:pStyle w:val="16"/>
+        <w:numPr>
+          <w:ilvl w:val="0"/>
+          <w:numId w:val="1"/>
+        </w:numPr>
+        <w:spacing w:after="80"/>
+        <w:rPr>
+          <w:rFonts w:hint="default"/>
+        </w:rPr>
+      </w:pPr>
+      <w:r>
+        <w:rPr>
+          <w:rFonts w:hint="default"/>
+        </w:rPr>
+        <w:t>04_Projects/UART/: Khởi tạo và hoàn thành project UART Echo Loopback (8N1, 115200 bps).</w:t>
+      </w:r>
+    </w:p>
+    <w:p>
+      <w:pPr>
+        <w:pStyle w:val="16"/>
+        <w:numPr>
+          <w:ilvl w:val="0"/>
+          <w:numId w:val="1"/>
+        </w:numPr>
+        <w:spacing w:after="80"/>
+        <w:rPr>
+          <w:rFonts w:hint="default"/>
+        </w:rPr>
+      </w:pPr>
+      <w:r>
+        <w:rPr>
+          <w:rFonts w:hint="default"/>
+        </w:rPr>
+        <w:t>04_Projects/UART/RTL/: Thêm các module uart_tx.v, uart_rx.v (áp dụng mid-bit sampling &amp; double-flop synchronizer) và uart_top.v ánh xạ trực tiếp GPIO.</w:t>
+      </w:r>
+    </w:p>
+    <w:p>
+      <w:pPr>
+        <w:pStyle w:val="16"/>
+        <w:numPr>
+          <w:ilvl w:val="0"/>
+          <w:numId w:val="1"/>
+        </w:numPr>
+        <w:spacing w:after="80"/>
+        <w:rPr>
+          <w:rFonts w:hint="default"/>
+        </w:rPr>
+      </w:pPr>
+      <w:r>
+        <w:rPr>
+          <w:rFonts w:hint="default"/>
+        </w:rPr>
+        <w:t>04_Projects/UART/Simulation/: Thêm 2 file Self-Checking testbench (tb_uart_tx.v, tb_uart_rx.v) và script chạy tự động (run_tx.do, run_rx.do).</w:t>
+      </w:r>
+    </w:p>
+    <w:p>
+      <w:pPr>
+        <w:pStyle w:val="16"/>
+        <w:numPr>
+          <w:ilvl w:val="0"/>
+          <w:numId w:val="1"/>
+        </w:numPr>
+        <w:spacing w:after="80"/>
+        <w:rPr>
+          <w:rFonts w:hint="default"/>
+        </w:rPr>
+      </w:pPr>
+      <w:r>
+        <w:rPr>
+          <w:rFonts w:hint="default"/>
+        </w:rPr>
+        <w:t>04_Projects/UART/Images/: Thêm ảnh chụp waveform testbench thành công (tb_uart_rx_success.png, tb_uart_tx_success.png).</w:t>
+      </w:r>
+    </w:p>
+    <w:p>
+      <w:pPr>
+        <w:pStyle w:val="4"/>
+        <w:spacing w:before="240" w:after="120"/>
+        <w:rPr>
+          <w:rFonts w:hint="default"/>
+        </w:rPr>
+      </w:pPr>
+      <w:r>
+        <w:rPr>
+          <w:rFonts w:ascii="Calibri" w:hAnsi="Calibri" w:eastAsia="Calibri" w:cs="Calibri"/>
+          <w:b/>
+          <w:bCs/>
+          <w:color w:val="595959"/>
+        </w:rPr>
+        <w:t>Changed</w:t>
+      </w:r>
+    </w:p>
+    <w:p>
+      <w:pPr>
+        <w:pStyle w:val="16"/>
+        <w:numPr>
+          <w:ilvl w:val="0"/>
+          <w:numId w:val="1"/>
+        </w:numPr>
+        <w:spacing w:after="80"/>
+        <w:rPr>
+          <w:rFonts w:hint="default"/>
+        </w:rPr>
+      </w:pPr>
+      <w:r>
+        <w:rPr>
+          <w:rFonts w:hint="default"/>
+        </w:rPr>
+        <w:t>Hoàn thiện nội dung "Volume IV - Peripherals and IO", Chương 1: UART (8N1, Baud Rate).</w:t>
+      </w:r>
+    </w:p>
+    <w:p>
+      <w:pPr>
+        <w:pStyle w:val="16"/>
+        <w:numPr>
+          <w:ilvl w:val="0"/>
+          <w:numId w:val="1"/>
+        </w:numPr>
+        <w:spacing w:after="80"/>
+        <w:rPr>
+          <w:rFonts w:hint="default"/>
+          <w:b w:val="0"/>
+          <w:bCs w:val="0"/>
+          <w:lang w:val="vi-VN"/>
+        </w:rPr>
+      </w:pPr>
+      <w:r>
+        <w:rPr>
+          <w:rFonts w:hint="default"/>
+        </w:rPr>
+        <w:t>Hoàn thiện nội dung "Volume III - Verification and Simulation</w:t>
+      </w:r>
       <w:bookmarkStart w:id="0" w:name="_GoBack"/>
       <w:bookmarkEnd w:id="0"/>
+      <w:r>
+        <w:rPr>
+          <w:rFonts w:hint="default"/>
+        </w:rPr>
+        <w:t>", Chương 2: Self-Checking Testbench.</w:t>
+      </w:r>
+    </w:p>
+    <w:p>
+      <w:pPr>
+        <w:pStyle w:val="4"/>
+        <w:spacing w:before="240" w:after="120"/>
+      </w:pPr>
+      <w:r>
+        <w:rPr>
+          <w:rFonts w:ascii="Calibri" w:hAnsi="Calibri" w:eastAsia="Calibri" w:cs="Calibri"/>
+          <w:b/>
+          <w:bCs/>
+          <w:color w:val="595959"/>
+        </w:rPr>
+        <w:t>Fixed</w:t>
+      </w:r>
+    </w:p>
+    <w:p>
+      <w:pPr>
+        <w:spacing w:after="160"/>
+      </w:pPr>
+      <w:r>
+        <w:rPr>
+          <w:rFonts w:ascii="Calibri" w:hAnsi="Calibri" w:eastAsia="Calibri" w:cs="Calibri"/>
+          <w:b w:val="0"/>
+          <w:bCs w:val="0"/>
+          <w:i w:val="0"/>
+          <w:iCs w:val="0"/>
+          <w:color w:val="000000"/>
+          <w:sz w:val="21"/>
+          <w:szCs w:val="21"/>
+        </w:rPr>
+        <w:t>(chưa có)</w:t>
+      </w:r>
+    </w:p>
+    <w:p>
+      <w:pPr>
+        <w:pStyle w:val="4"/>
+        <w:spacing w:before="240" w:after="120"/>
+      </w:pPr>
+      <w:r>
+        <w:rPr>
+          <w:rFonts w:ascii="Calibri" w:hAnsi="Calibri" w:eastAsia="Calibri" w:cs="Calibri"/>
+          <w:b/>
+          <w:bCs/>
+          <w:color w:val="595959"/>
+        </w:rPr>
+        <w:t>Removed</w:t>
+      </w:r>
+    </w:p>
+    <w:p>
+      <w:pPr>
+        <w:spacing w:after="160"/>
+      </w:pPr>
+      <w:r>
+        <w:rPr>
+          <w:rFonts w:ascii="Calibri" w:hAnsi="Calibri" w:eastAsia="Calibri" w:cs="Calibri"/>
+          <w:b w:val="0"/>
+          <w:bCs w:val="0"/>
+          <w:i w:val="0"/>
+          <w:iCs w:val="0"/>
+          <w:color w:val="000000"/>
+          <w:sz w:val="21"/>
+          <w:szCs w:val="21"/>
+        </w:rPr>
+        <w:t>(chưa có)</w:t>
+      </w:r>
+    </w:p>
+    <w:p>
+      <w:pPr>
+        <w:pBdr>
+          <w:bottom w:val="single" w:color="595959" w:sz="6" w:space="1"/>
+        </w:pBdr>
+        <w:spacing w:before="100" w:after="200"/>
+      </w:pPr>
+    </w:p>
+    <w:p>
+      <w:pPr>
+        <w:spacing w:after="160"/>
+        <w:rPr>
+          <w:rFonts w:ascii="Calibri" w:hAnsi="Calibri" w:eastAsia="Calibri" w:cs="Calibri"/>
+          <w:b w:val="0"/>
+          <w:bCs w:val="0"/>
+          <w:i w:val="0"/>
+          <w:iCs w:val="0"/>
+          <w:color w:val="000000"/>
+          <w:sz w:val="21"/>
+          <w:szCs w:val="21"/>
+        </w:rPr>
+      </w:pPr>
+    </w:p>
+    <w:p>
+      <w:pPr>
+        <w:spacing w:after="160"/>
+        <w:rPr>
+          <w:rFonts w:ascii="Calibri" w:hAnsi="Calibri" w:eastAsia="Calibri" w:cs="Calibri"/>
+          <w:b w:val="0"/>
+          <w:bCs w:val="0"/>
+          <w:i w:val="0"/>
+          <w:iCs w:val="0"/>
+          <w:color w:val="000000"/>
+          <w:sz w:val="21"/>
+          <w:szCs w:val="21"/>
+        </w:rPr>
+      </w:pPr>
     </w:p>
     <w:p>
       <w:pPr>

</xml_diff>

<commit_message>
[Project][v0.8.0] Cập nhật code.. Lưu ý lỗi của nguồn điện trên Kit Board.
</commit_message>
<xml_diff>
--- a/00_Project_Management/Change Log.docx
+++ b/00_Project_Management/Change Log.docx
@@ -1097,12 +1097,6 @@
             <w:insideH w:val="single" w:color="auto" w:sz="4" w:space="0"/>
             <w:insideV w:val="single" w:color="auto" w:sz="4" w:space="0"/>
           </w:tblBorders>
-          <w:tblCellMar>
-            <w:top w:w="0" w:type="dxa"/>
-            <w:left w:w="10" w:type="dxa"/>
-            <w:bottom w:w="0" w:type="dxa"/>
-            <w:right w:w="10" w:type="dxa"/>
-          </w:tblCellMar>
         </w:tblPrEx>
         <w:tc>
           <w:tcPr>
@@ -3438,15 +3432,7 @@
         <w:rPr>
           <w:rFonts w:hint="default"/>
         </w:rPr>
-        <w:t>Hoàn thiện nội dung "Volume III - Verification and Simulation</w:t>
-      </w:r>
-      <w:bookmarkStart w:id="0" w:name="_GoBack"/>
-      <w:bookmarkEnd w:id="0"/>
-      <w:r>
-        <w:rPr>
-          <w:rFonts w:hint="default"/>
-        </w:rPr>
-        <w:t>", Chương 2: Self-Checking Testbench.</w:t>
+        <w:t>Hoàn thiện nội dung "Volume III - Verification and Simulation", Chương 2: Self-Checking Testbench.</w:t>
       </w:r>
     </w:p>
     <w:p>
@@ -3521,6 +3507,365 @@
           <w:bottom w:val="single" w:color="595959" w:sz="6" w:space="1"/>
         </w:pBdr>
         <w:spacing w:before="100" w:after="200"/>
+      </w:pPr>
+    </w:p>
+    <w:p>
+      <w:pPr>
+        <w:spacing w:after="160"/>
+        <w:rPr>
+          <w:rFonts w:ascii="Calibri" w:hAnsi="Calibri" w:eastAsia="Calibri" w:cs="Calibri"/>
+          <w:b w:val="0"/>
+          <w:bCs w:val="0"/>
+          <w:i w:val="0"/>
+          <w:iCs w:val="0"/>
+          <w:color w:val="000000"/>
+          <w:sz w:val="21"/>
+          <w:szCs w:val="21"/>
+        </w:rPr>
+      </w:pPr>
+    </w:p>
+    <w:p>
+      <w:pPr>
+        <w:pStyle w:val="3"/>
+        <w:spacing w:before="320" w:after="160"/>
+      </w:pPr>
+      <w:r>
+        <w:rPr>
+          <w:rFonts w:ascii="Calibri" w:hAnsi="Calibri" w:eastAsia="Calibri" w:cs="Calibri"/>
+          <w:b/>
+          <w:bCs/>
+          <w:color w:val="2E5395"/>
+        </w:rPr>
+        <w:t>[v0.</w:t>
+      </w:r>
+      <w:r>
+        <w:rPr>
+          <w:rFonts w:hint="default" w:cs="Calibri"/>
+          <w:b/>
+          <w:bCs/>
+          <w:color w:val="2E5395"/>
+          <w:lang w:val="en-US"/>
+        </w:rPr>
+        <w:t>8</w:t>
+      </w:r>
+      <w:r>
+        <w:rPr>
+          <w:rFonts w:ascii="Calibri" w:hAnsi="Calibri" w:eastAsia="Calibri" w:cs="Calibri"/>
+          <w:b/>
+          <w:bCs/>
+          <w:color w:val="2E5395"/>
+        </w:rPr>
+        <w:t xml:space="preserve">.0] - </w:t>
+      </w:r>
+      <w:r>
+        <w:rPr>
+          <w:rFonts w:hint="default" w:ascii="Calibri" w:hAnsi="Calibri" w:eastAsia="Calibri" w:cs="Calibri"/>
+          <w:b/>
+          <w:bCs/>
+          <w:color w:val="2E5395"/>
+          <w:lang w:val="en-US"/>
+        </w:rPr>
+        <w:t>0</w:t>
+      </w:r>
+      <w:r>
+        <w:rPr>
+          <w:rFonts w:hint="default" w:cs="Calibri"/>
+          <w:b/>
+          <w:bCs/>
+          <w:color w:val="2E5395"/>
+          <w:lang w:val="en-US"/>
+        </w:rPr>
+        <w:t>9</w:t>
+      </w:r>
+      <w:r>
+        <w:rPr>
+          <w:rFonts w:ascii="Calibri" w:hAnsi="Calibri" w:eastAsia="Calibri" w:cs="Calibri"/>
+          <w:b/>
+          <w:bCs/>
+          <w:color w:val="2E5395"/>
+        </w:rPr>
+        <w:t xml:space="preserve"> /</w:t>
+      </w:r>
+      <w:r>
+        <w:rPr>
+          <w:rFonts w:hint="default" w:ascii="Calibri" w:hAnsi="Calibri" w:eastAsia="Calibri" w:cs="Calibri"/>
+          <w:b/>
+          <w:bCs/>
+          <w:color w:val="2E5395"/>
+          <w:lang w:val="en-US"/>
+        </w:rPr>
+        <w:t>08</w:t>
+      </w:r>
+      <w:r>
+        <w:rPr>
+          <w:rFonts w:ascii="Calibri" w:hAnsi="Calibri" w:eastAsia="Calibri" w:cs="Calibri"/>
+          <w:b/>
+          <w:bCs/>
+          <w:color w:val="2E5395"/>
+        </w:rPr>
+        <w:t xml:space="preserve"> /2026</w:t>
+      </w:r>
+    </w:p>
+    <w:p>
+      <w:pPr>
+        <w:pStyle w:val="4"/>
+        <w:spacing w:before="240" w:after="120"/>
+      </w:pPr>
+      <w:r>
+        <w:rPr>
+          <w:rFonts w:ascii="Calibri" w:hAnsi="Calibri" w:eastAsia="Calibri" w:cs="Calibri"/>
+          <w:b/>
+          <w:bCs/>
+          <w:color w:val="595959"/>
+        </w:rPr>
+        <w:t>Added</w:t>
+      </w:r>
+    </w:p>
+    <w:p>
+      <w:pPr>
+        <w:pStyle w:val="16"/>
+        <w:numPr>
+          <w:ilvl w:val="0"/>
+          <w:numId w:val="1"/>
+        </w:numPr>
+        <w:spacing w:after="80"/>
+        <w:rPr>
+          <w:rFonts w:hint="default"/>
+        </w:rPr>
+      </w:pPr>
+      <w:r>
+        <w:rPr>
+          <w:rFonts w:hint="default"/>
+        </w:rPr>
+        <w:t>04_Projects/VGA/: Khởi tạo và hoàn thành project xuất tín hiệu VGA Color Bar Pattern (chuẩn 640x480@60Hz).</w:t>
+      </w:r>
+    </w:p>
+    <w:p>
+      <w:pPr>
+        <w:pStyle w:val="16"/>
+        <w:numPr>
+          <w:ilvl w:val="0"/>
+          <w:numId w:val="1"/>
+        </w:numPr>
+        <w:spacing w:after="80"/>
+        <w:rPr>
+          <w:rFonts w:hint="default"/>
+        </w:rPr>
+      </w:pPr>
+      <w:r>
+        <w:rPr>
+          <w:rFonts w:hint="default"/>
+          <w:lang w:val="en-US"/>
+        </w:rPr>
+        <w:t>0</w:t>
+      </w:r>
+      <w:r>
+        <w:rPr>
+          <w:rFonts w:hint="default"/>
+        </w:rPr>
+        <w:t>4_Projects/VGA/RTL/: Thêm top module `fpga_vga.v`, module điều khiển `vga_timing.v`, module tạo mẫu màu `color_bar_pattern.v` và tích hợp IP Altera PLL `pll_25m175`.</w:t>
+      </w:r>
+    </w:p>
+    <w:p>
+      <w:pPr>
+        <w:pStyle w:val="16"/>
+        <w:numPr>
+          <w:ilvl w:val="0"/>
+          <w:numId w:val="1"/>
+        </w:numPr>
+        <w:spacing w:after="80"/>
+        <w:rPr>
+          <w:rFonts w:hint="default"/>
+        </w:rPr>
+      </w:pPr>
+      <w:r>
+        <w:rPr>
+          <w:rFonts w:hint="default"/>
+        </w:rPr>
+        <w:t>04_Projects/VGA/Simulation/: Thêm testbench `tb_vga_timing.v` và script chạy tự động `run.do`.</w:t>
+      </w:r>
+    </w:p>
+    <w:p>
+      <w:pPr>
+        <w:pStyle w:val="16"/>
+        <w:numPr>
+          <w:ilvl w:val="0"/>
+          <w:numId w:val="1"/>
+        </w:numPr>
+        <w:spacing w:after="80"/>
+        <w:rPr>
+          <w:rFonts w:hint="default"/>
+        </w:rPr>
+      </w:pPr>
+      <w:r>
+        <w:rPr>
+          <w:rFonts w:hint="default"/>
+        </w:rPr>
+        <w:t>04_Projects/VGA/Images/: Thêm ảnh waveform chứng minh timing hsync/vsync/pixel_x/pixel_y hoạt động chính xác (`tb_vga_timing_success.png`).</w:t>
+      </w:r>
+    </w:p>
+    <w:p>
+      <w:pPr>
+        <w:pStyle w:val="16"/>
+        <w:numPr>
+          <w:ilvl w:val="0"/>
+          <w:numId w:val="1"/>
+        </w:numPr>
+        <w:spacing w:after="80"/>
+        <w:rPr>
+          <w:rFonts w:hint="default"/>
+        </w:rPr>
+      </w:pPr>
+      <w:r>
+        <w:rPr>
+          <w:rFonts w:hint="default"/>
+          <w:lang w:val="vi-VN"/>
+        </w:rPr>
+        <w:t xml:space="preserve">Lưu Ý, nhận thấy cổng nhận nguồn điện của Kit có vấn đề rod điện, khi cắm vào và lay cổng cắm nhưng chưa được nhấn nút cấp nguồn mà kit vẫn tự được cung cấp điện chớp tắt và kêu tiếng xẹt xẹt. Tuy nhiên, tôi đã rút dây cấp nguồn ra khi không cần dùng. </w:t>
+      </w:r>
+      <w:bookmarkStart w:id="0" w:name="_GoBack"/>
+      <w:bookmarkEnd w:id="0"/>
+      <w:r>
+        <w:rPr>
+          <w:rFonts w:hint="default"/>
+          <w:lang w:val="vi-VN"/>
+        </w:rPr>
+        <w:t xml:space="preserve"> </w:t>
+      </w:r>
+    </w:p>
+    <w:p>
+      <w:pPr>
+        <w:pStyle w:val="4"/>
+        <w:spacing w:before="240" w:after="120"/>
+        <w:rPr>
+          <w:rFonts w:hint="default"/>
+          <w:b w:val="0"/>
+          <w:bCs w:val="0"/>
+          <w:lang w:val="vi-VN"/>
+        </w:rPr>
+      </w:pPr>
+      <w:r>
+        <w:rPr>
+          <w:rFonts w:ascii="Calibri" w:hAnsi="Calibri" w:eastAsia="Calibri" w:cs="Calibri"/>
+          <w:b/>
+          <w:bCs/>
+          <w:color w:val="595959"/>
+        </w:rPr>
+        <w:t>Changed</w:t>
+      </w:r>
+    </w:p>
+    <w:p>
+      <w:pPr>
+        <w:pStyle w:val="16"/>
+        <w:numPr>
+          <w:ilvl w:val="0"/>
+          <w:numId w:val="1"/>
+        </w:numPr>
+        <w:spacing w:after="80"/>
+        <w:rPr>
+          <w:rFonts w:hint="default"/>
+          <w:b w:val="0"/>
+          <w:bCs w:val="0"/>
+          <w:lang w:val="vi-VN"/>
+        </w:rPr>
+      </w:pPr>
+      <w:r>
+        <w:rPr>
+          <w:rFonts w:hint="default"/>
+          <w:b w:val="0"/>
+          <w:bCs w:val="0"/>
+          <w:lang w:val="vi-VN"/>
+        </w:rPr>
+        <w:t>02_Handbook/Volume IV_Peripherals_and_IO.docx: Hoàn thiện trạng thái nội dung Chương 4 (VGA Timing &amp; Color Bar).</w:t>
+      </w:r>
+    </w:p>
+    <w:p>
+      <w:pPr>
+        <w:pStyle w:val="4"/>
+        <w:spacing w:before="240" w:after="120"/>
+      </w:pPr>
+      <w:r>
+        <w:rPr>
+          <w:rFonts w:ascii="Calibri" w:hAnsi="Calibri" w:eastAsia="Calibri" w:cs="Calibri"/>
+          <w:b/>
+          <w:bCs/>
+          <w:color w:val="595959"/>
+        </w:rPr>
+        <w:t>Fixed</w:t>
+      </w:r>
+    </w:p>
+    <w:p>
+      <w:pPr>
+        <w:spacing w:after="160"/>
+      </w:pPr>
+      <w:r>
+        <w:rPr>
+          <w:rFonts w:ascii="Calibri" w:hAnsi="Calibri" w:eastAsia="Calibri" w:cs="Calibri"/>
+          <w:b w:val="0"/>
+          <w:bCs w:val="0"/>
+          <w:i w:val="0"/>
+          <w:iCs w:val="0"/>
+          <w:color w:val="000000"/>
+          <w:sz w:val="21"/>
+          <w:szCs w:val="21"/>
+        </w:rPr>
+        <w:t>(chưa có)</w:t>
+      </w:r>
+    </w:p>
+    <w:p>
+      <w:pPr>
+        <w:pStyle w:val="4"/>
+        <w:spacing w:before="240" w:after="120"/>
+      </w:pPr>
+      <w:r>
+        <w:rPr>
+          <w:rFonts w:ascii="Calibri" w:hAnsi="Calibri" w:eastAsia="Calibri" w:cs="Calibri"/>
+          <w:b/>
+          <w:bCs/>
+          <w:color w:val="595959"/>
+        </w:rPr>
+        <w:t>Removed</w:t>
+      </w:r>
+    </w:p>
+    <w:p>
+      <w:pPr>
+        <w:spacing w:after="160"/>
+      </w:pPr>
+      <w:r>
+        <w:rPr>
+          <w:rFonts w:ascii="Calibri" w:hAnsi="Calibri" w:eastAsia="Calibri" w:cs="Calibri"/>
+          <w:b w:val="0"/>
+          <w:bCs w:val="0"/>
+          <w:i w:val="0"/>
+          <w:iCs w:val="0"/>
+          <w:color w:val="000000"/>
+          <w:sz w:val="21"/>
+          <w:szCs w:val="21"/>
+        </w:rPr>
+        <w:t>(chưa có)</w:t>
+      </w:r>
+    </w:p>
+    <w:p>
+      <w:pPr>
+        <w:pBdr>
+          <w:bottom w:val="single" w:color="595959" w:sz="6" w:space="1"/>
+        </w:pBdr>
+        <w:spacing w:before="100" w:after="200"/>
+      </w:pPr>
+    </w:p>
+    <w:p>
+      <w:pPr>
+        <w:spacing w:after="160"/>
+        <w:rPr>
+          <w:rFonts w:ascii="Calibri" w:hAnsi="Calibri" w:eastAsia="Calibri" w:cs="Calibri"/>
+          <w:b w:val="0"/>
+          <w:bCs w:val="0"/>
+          <w:i w:val="0"/>
+          <w:iCs w:val="0"/>
+          <w:color w:val="000000"/>
+          <w:sz w:val="21"/>
+          <w:szCs w:val="21"/>
+        </w:rPr>
       </w:pPr>
     </w:p>
     <w:p>

</xml_diff>

<commit_message>
[Project][v0.8.0] Cập nhật 89% SPI và thông tin về "reset"
</commit_message>
<xml_diff>
--- a/00_Project_Management/Change Log.docx
+++ b/00_Project_Management/Change Log.docx
@@ -3721,16 +3721,7 @@
           <w:rFonts w:hint="default"/>
           <w:lang w:val="vi-VN"/>
         </w:rPr>
-        <w:t xml:space="preserve">Lưu Ý, nhận thấy cổng nhận nguồn điện của Kit có vấn đề rod điện, khi cắm vào và lay cổng cắm nhưng chưa được nhấn nút cấp nguồn mà kit vẫn tự được cung cấp điện chớp tắt và kêu tiếng xẹt xẹt. Tuy nhiên, tôi đã rút dây cấp nguồn ra khi không cần dùng. </w:t>
-      </w:r>
-      <w:bookmarkStart w:id="0" w:name="_GoBack"/>
-      <w:bookmarkEnd w:id="0"/>
-      <w:r>
-        <w:rPr>
-          <w:rFonts w:hint="default"/>
-          <w:lang w:val="vi-VN"/>
-        </w:rPr>
-        <w:t xml:space="preserve"> </w:t>
+        <w:t xml:space="preserve">Lưu Ý, nhận thấy cổng nhận nguồn điện của Kit có vấn đề rod điện, khi cắm vào và lay cổng cắm nhưng chưa được nhấn nút cấp nguồn mà kit vẫn tự được cung cấp điện chớp tắt và kêu tiếng xẹt xẹt. Tuy nhiên, tôi đã rút dây cấp nguồn ra khi không cần dùng.  </w:t>
       </w:r>
     </w:p>
     <w:p>
@@ -3851,6 +3842,422 @@
           <w:bottom w:val="single" w:color="595959" w:sz="6" w:space="1"/>
         </w:pBdr>
         <w:spacing w:before="100" w:after="200"/>
+      </w:pPr>
+    </w:p>
+    <w:p>
+      <w:pPr>
+        <w:spacing w:after="160"/>
+        <w:rPr>
+          <w:rFonts w:ascii="Calibri" w:hAnsi="Calibri" w:eastAsia="Calibri" w:cs="Calibri"/>
+          <w:b w:val="0"/>
+          <w:bCs w:val="0"/>
+          <w:i w:val="0"/>
+          <w:iCs w:val="0"/>
+          <w:color w:val="000000"/>
+          <w:sz w:val="21"/>
+          <w:szCs w:val="21"/>
+        </w:rPr>
+      </w:pPr>
+    </w:p>
+    <w:p>
+      <w:pPr>
+        <w:pStyle w:val="3"/>
+        <w:spacing w:before="320" w:after="160"/>
+      </w:pPr>
+      <w:r>
+        <w:rPr>
+          <w:rFonts w:ascii="Calibri" w:hAnsi="Calibri" w:eastAsia="Calibri" w:cs="Calibri"/>
+          <w:b/>
+          <w:bCs/>
+          <w:color w:val="2E5395"/>
+        </w:rPr>
+        <w:t>[v0.</w:t>
+      </w:r>
+      <w:r>
+        <w:rPr>
+          <w:rFonts w:hint="default" w:ascii="Calibri" w:hAnsi="Calibri" w:eastAsia="Calibri" w:cs="Calibri"/>
+          <w:b/>
+          <w:bCs/>
+          <w:color w:val="2E5395"/>
+          <w:lang w:val="en-US"/>
+        </w:rPr>
+        <w:t>9</w:t>
+      </w:r>
+      <w:r>
+        <w:rPr>
+          <w:rFonts w:ascii="Calibri" w:hAnsi="Calibri" w:eastAsia="Calibri" w:cs="Calibri"/>
+          <w:b/>
+          <w:bCs/>
+          <w:color w:val="2E5395"/>
+        </w:rPr>
+        <w:t xml:space="preserve">.0] - </w:t>
+      </w:r>
+      <w:r>
+        <w:rPr>
+          <w:rFonts w:hint="default" w:ascii="Calibri" w:hAnsi="Calibri" w:eastAsia="Calibri" w:cs="Calibri"/>
+          <w:b/>
+          <w:bCs/>
+          <w:color w:val="2E5395"/>
+          <w:lang w:val="en-US"/>
+        </w:rPr>
+        <w:t>10</w:t>
+      </w:r>
+      <w:r>
+        <w:rPr>
+          <w:rFonts w:ascii="Calibri" w:hAnsi="Calibri" w:eastAsia="Calibri" w:cs="Calibri"/>
+          <w:b/>
+          <w:bCs/>
+          <w:color w:val="2E5395"/>
+        </w:rPr>
+        <w:t xml:space="preserve"> /</w:t>
+      </w:r>
+      <w:r>
+        <w:rPr>
+          <w:rFonts w:hint="default" w:ascii="Calibri" w:hAnsi="Calibri" w:eastAsia="Calibri" w:cs="Calibri"/>
+          <w:b/>
+          <w:bCs/>
+          <w:color w:val="2E5395"/>
+          <w:lang w:val="en-US"/>
+        </w:rPr>
+        <w:t>08</w:t>
+      </w:r>
+      <w:r>
+        <w:rPr>
+          <w:rFonts w:ascii="Calibri" w:hAnsi="Calibri" w:eastAsia="Calibri" w:cs="Calibri"/>
+          <w:b/>
+          <w:bCs/>
+          <w:color w:val="2E5395"/>
+        </w:rPr>
+        <w:t xml:space="preserve"> /2026</w:t>
+      </w:r>
+    </w:p>
+    <w:p>
+      <w:pPr>
+        <w:pStyle w:val="4"/>
+        <w:spacing w:before="240" w:after="120"/>
+      </w:pPr>
+      <w:r>
+        <w:rPr>
+          <w:rFonts w:ascii="Calibri" w:hAnsi="Calibri" w:eastAsia="Calibri" w:cs="Calibri"/>
+          <w:b/>
+          <w:bCs/>
+          <w:color w:val="595959"/>
+        </w:rPr>
+        <w:t>Added</w:t>
+      </w:r>
+    </w:p>
+    <w:p>
+      <w:pPr>
+        <w:pStyle w:val="16"/>
+        <w:numPr>
+          <w:ilvl w:val="0"/>
+          <w:numId w:val="1"/>
+        </w:numPr>
+        <w:spacing w:after="80"/>
+        <w:rPr>
+          <w:rFonts w:hint="default"/>
+        </w:rPr>
+      </w:pPr>
+      <w:r>
+        <w:rPr>
+          <w:rFonts w:hint="default"/>
+        </w:rPr>
+        <w:t>**04_Projects/SPI/RTL/**: Khởi tạo và hoàn thiện trọn bộ IP Core SPI Loopback BIST giao tiếp song công (Full-Duplex) chuẩn **SPI Mode 3** (CPOL=1, CPHA=1).</w:t>
+      </w:r>
+    </w:p>
+    <w:p>
+      <w:pPr>
+        <w:pStyle w:val="16"/>
+        <w:numPr>
+          <w:ilvl w:val="0"/>
+          <w:numId w:val="1"/>
+        </w:numPr>
+        <w:spacing w:after="80"/>
+        <w:rPr>
+          <w:rFonts w:hint="default"/>
+        </w:rPr>
+      </w:pPr>
+      <w:r>
+        <w:rPr>
+          <w:rFonts w:hint="default"/>
+        </w:rPr>
+        <w:t xml:space="preserve">  - `spi_master.v`: SPI Master Engine tích hợp bộ chia clock an toàn với `$clog2`, hỗ trợ thời gian `tCSS` (CS setup time).</w:t>
+      </w:r>
+    </w:p>
+    <w:p>
+      <w:pPr>
+        <w:pStyle w:val="16"/>
+        <w:numPr>
+          <w:ilvl w:val="0"/>
+          <w:numId w:val="1"/>
+        </w:numPr>
+        <w:spacing w:after="80"/>
+        <w:rPr>
+          <w:rFonts w:hint="default"/>
+        </w:rPr>
+      </w:pPr>
+      <w:r>
+        <w:rPr>
+          <w:rFonts w:hint="default"/>
+        </w:rPr>
+        <w:t xml:space="preserve">  - `spi_slave.v`: SPI Slave Engine chống bất ổn định (Metastability safe) với 3-stage synchronizer cho SCLK/CS_N.</w:t>
+      </w:r>
+    </w:p>
+    <w:p>
+      <w:pPr>
+        <w:pStyle w:val="16"/>
+        <w:numPr>
+          <w:ilvl w:val="0"/>
+          <w:numId w:val="1"/>
+        </w:numPr>
+        <w:spacing w:after="80"/>
+        <w:rPr>
+          <w:rFonts w:hint="default"/>
+        </w:rPr>
+      </w:pPr>
+      <w:r>
+        <w:rPr>
+          <w:rFonts w:hint="default"/>
+        </w:rPr>
+        <w:t xml:space="preserve">  - `spi_bist.v`: Built-In Self-Test Controller tự động sinh 8 Test Pattern (All 0, All 1, Checkerboard 0xAA/0x55, Walking 1s) kèm bộ so sánh kết quả tự động (Scoreboard). Hỗ trợ parameter `TEST_INTERVAL` linh hoạt cho Simulation/Hardware.</w:t>
+      </w:r>
+    </w:p>
+    <w:p>
+      <w:pPr>
+        <w:pStyle w:val="16"/>
+        <w:numPr>
+          <w:ilvl w:val="0"/>
+          <w:numId w:val="1"/>
+        </w:numPr>
+        <w:spacing w:after="80"/>
+        <w:rPr>
+          <w:rFonts w:hint="default"/>
+        </w:rPr>
+      </w:pPr>
+      <w:r>
+        <w:rPr>
+          <w:rFonts w:hint="default"/>
+        </w:rPr>
+        <w:t xml:space="preserve">  - `spi_top.v`: Top-level lắp ráp toàn bộ hệ thống, tích hợp mạch **Reset Synchronizer 2 tầng** (Asynchronous Assertion, Synchronous De-assertion) cho `KEY[0]` và khối **Hardware Error Injector** điều khiển qua `KEY[1]`.</w:t>
+      </w:r>
+    </w:p>
+    <w:p>
+      <w:pPr>
+        <w:pStyle w:val="16"/>
+        <w:numPr>
+          <w:ilvl w:val="0"/>
+          <w:numId w:val="1"/>
+        </w:numPr>
+        <w:spacing w:after="80"/>
+        <w:rPr>
+          <w:rFonts w:hint="default"/>
+        </w:rPr>
+      </w:pPr>
+      <w:r>
+        <w:rPr>
+          <w:rFonts w:hint="default"/>
+        </w:rPr>
+        <w:t xml:space="preserve">- **04_Projects/SPI/Simulation/**: </w:t>
+      </w:r>
+    </w:p>
+    <w:p>
+      <w:pPr>
+        <w:pStyle w:val="16"/>
+        <w:numPr>
+          <w:ilvl w:val="0"/>
+          <w:numId w:val="1"/>
+        </w:numPr>
+        <w:spacing w:after="80"/>
+        <w:rPr>
+          <w:rFonts w:hint="default"/>
+        </w:rPr>
+      </w:pPr>
+      <w:r>
+        <w:rPr>
+          <w:rFonts w:hint="default"/>
+        </w:rPr>
+        <w:t xml:space="preserve">  - `tb_spi_loopback.v`: Self-checking testbench mô phỏng kịch bản BIST tự động, kiểm thử bơm lỗi (Error Injection) và khả năng tự phục hồi (Recovery).</w:t>
+      </w:r>
+    </w:p>
+    <w:p>
+      <w:pPr>
+        <w:pStyle w:val="16"/>
+        <w:numPr>
+          <w:ilvl w:val="0"/>
+          <w:numId w:val="1"/>
+        </w:numPr>
+        <w:spacing w:after="80"/>
+        <w:rPr>
+          <w:rFonts w:hint="default"/>
+        </w:rPr>
+      </w:pPr>
+      <w:r>
+        <w:rPr>
+          <w:rFonts w:hint="default"/>
+        </w:rPr>
+        <w:t xml:space="preserve">  - `run_spi_loopback.do`: Script Tcl tự động biên dịch và tạo Waveform hiển thị rõ các cạnh Shift/Sample của SPI Mode 3 trên ModelSim.</w:t>
+      </w:r>
+    </w:p>
+    <w:p>
+      <w:pPr>
+        <w:pStyle w:val="16"/>
+        <w:numPr>
+          <w:ilvl w:val="0"/>
+          <w:numId w:val="1"/>
+        </w:numPr>
+        <w:spacing w:after="80"/>
+        <w:rPr>
+          <w:rFonts w:hint="default"/>
+        </w:rPr>
+      </w:pPr>
+      <w:r>
+        <w:rPr>
+          <w:rFonts w:hint="default"/>
+        </w:rPr>
+        <w:t>- **04_Projects/SPI/Quartus/**:</w:t>
+      </w:r>
+    </w:p>
+    <w:p>
+      <w:pPr>
+        <w:pStyle w:val="16"/>
+        <w:numPr>
+          <w:ilvl w:val="0"/>
+          <w:numId w:val="1"/>
+        </w:numPr>
+        <w:spacing w:after="80"/>
+        <w:rPr>
+          <w:rFonts w:hint="default"/>
+        </w:rPr>
+      </w:pPr>
+      <w:r>
+        <w:rPr>
+          <w:rFonts w:hint="default"/>
+        </w:rPr>
+        <w:t xml:space="preserve">  - `spi.sdc`: Khai báo constraint clock 50MHz (`CLOCK_50`) và `set_false_path` cho các I/O tĩnh (`KEY`, `SW`, `LEDR`, `HEX`) giải quyết triệt để lỗi Recovery/Removal timing.</w:t>
+      </w:r>
+    </w:p>
+    <w:p>
+      <w:pPr>
+        <w:pStyle w:val="4"/>
+        <w:spacing w:before="240" w:after="120"/>
+        <w:rPr>
+          <w:rFonts w:hint="default"/>
+          <w:b w:val="0"/>
+          <w:bCs w:val="0"/>
+          <w:lang w:val="vi-VN"/>
+        </w:rPr>
+      </w:pPr>
+      <w:r>
+        <w:rPr>
+          <w:rFonts w:ascii="Calibri" w:hAnsi="Calibri" w:eastAsia="Calibri" w:cs="Calibri"/>
+          <w:b/>
+          <w:bCs/>
+          <w:color w:val="595959"/>
+        </w:rPr>
+        <w:t>Changed</w:t>
+      </w:r>
+    </w:p>
+    <w:p>
+      <w:pPr>
+        <w:pStyle w:val="4"/>
+        <w:spacing w:before="240" w:after="120"/>
+      </w:pPr>
+      <w:r>
+        <w:rPr>
+          <w:rFonts w:ascii="Calibri" w:hAnsi="Calibri" w:eastAsia="Calibri" w:cs="Calibri"/>
+          <w:b/>
+          <w:bCs/>
+          <w:color w:val="595959"/>
+        </w:rPr>
+        <w:t>Fixed</w:t>
+      </w:r>
+    </w:p>
+    <w:p>
+      <w:pPr>
+        <w:pStyle w:val="16"/>
+        <w:numPr>
+          <w:ilvl w:val="0"/>
+          <w:numId w:val="1"/>
+        </w:numPr>
+        <w:spacing w:after="80"/>
+        <w:rPr>
+          <w:rFonts w:hint="default"/>
+          <w:b w:val="0"/>
+          <w:bCs w:val="0"/>
+          <w:lang w:val="vi-VN"/>
+        </w:rPr>
+      </w:pPr>
+      <w:bookmarkStart w:id="0" w:name="_GoBack"/>
+      <w:bookmarkEnd w:id="0"/>
+      <w:r>
+        <w:rPr>
+          <w:rFonts w:hint="default"/>
+          <w:b w:val="0"/>
+          <w:bCs w:val="0"/>
+          <w:lang w:val="vi-VN"/>
+        </w:rPr>
+        <w:t>Khắc phục lỗi lệch Transaction trong mô hình Echo bằng cách chuyển sang kiến trúc Full-Duplex BIST (Slave tải trước Test Pattern tại cạnh xuống của CS_N).</w:t>
+      </w:r>
+    </w:p>
+    <w:p>
+      <w:pPr>
+        <w:spacing w:after="160"/>
+      </w:pPr>
+    </w:p>
+    <w:p>
+      <w:pPr>
+        <w:pStyle w:val="4"/>
+        <w:spacing w:before="240" w:after="120"/>
+      </w:pPr>
+      <w:r>
+        <w:rPr>
+          <w:rFonts w:ascii="Calibri" w:hAnsi="Calibri" w:eastAsia="Calibri" w:cs="Calibri"/>
+          <w:b/>
+          <w:bCs/>
+          <w:color w:val="595959"/>
+        </w:rPr>
+        <w:t>Removed</w:t>
+      </w:r>
+    </w:p>
+    <w:p>
+      <w:pPr>
+        <w:spacing w:after="160"/>
+      </w:pPr>
+      <w:r>
+        <w:rPr>
+          <w:rFonts w:ascii="Calibri" w:hAnsi="Calibri" w:eastAsia="Calibri" w:cs="Calibri"/>
+          <w:b w:val="0"/>
+          <w:bCs w:val="0"/>
+          <w:i w:val="0"/>
+          <w:iCs w:val="0"/>
+          <w:color w:val="000000"/>
+          <w:sz w:val="21"/>
+          <w:szCs w:val="21"/>
+        </w:rPr>
+        <w:t>(chưa có)</w:t>
+      </w:r>
+    </w:p>
+    <w:p>
+      <w:pPr>
+        <w:pBdr>
+          <w:bottom w:val="single" w:color="595959" w:sz="6" w:space="1"/>
+        </w:pBdr>
+        <w:spacing w:before="100" w:after="200"/>
+      </w:pPr>
+    </w:p>
+    <w:p>
+      <w:pPr>
+        <w:spacing w:after="160"/>
+        <w:rPr>
+          <w:rFonts w:ascii="Calibri" w:hAnsi="Calibri" w:eastAsia="Calibri" w:cs="Calibri"/>
+          <w:b w:val="0"/>
+          <w:bCs w:val="0"/>
+          <w:i w:val="0"/>
+          <w:iCs w:val="0"/>
+          <w:color w:val="000000"/>
+          <w:sz w:val="21"/>
+          <w:szCs w:val="21"/>
+        </w:rPr>
       </w:pPr>
     </w:p>
     <w:p>

</xml_diff>